<commit_message>
Dine endringer fra TILBUD2; stryk vedlegg E, renummerer
Vedlegg D beskrives nå bare som bredde- og rekrutteringsanalyse, siden
det er trenerartikkelen som vedlegges og ikke et eget sammendrag.
</commit_message>
<xml_diff>
--- a/NFIFProsjekt/tilbud/TILBUD.docx
+++ b/NFIFProsjekt/tilbud/TILBUD.docx
@@ -79,7 +79,13 @@
         <w:t xml:space="preserve"> </w:t>
       </w:r>
       <w:r>
-        <w:t xml:space="preserve">Thor Gjesdal (teknisk), Magnus Trosdahl (kommersielt)</w:t>
+        <w:t xml:space="preserve">Thor Gjesdal (teknisk), Magnus Trosdahl</w:t>
+      </w:r>
+      <w:r>
+        <w:t xml:space="preserve"> </w:t>
+      </w:r>
+      <w:r>
+        <w:t xml:space="preserve">(kommersielt)</w:t>
       </w:r>
     </w:p>
     <w:p>
@@ -757,13 +763,7 @@
         <w:t xml:space="preserve"> </w:t>
       </w:r>
       <w:r>
-        <w:t xml:space="preserve">ulik karakter, og en leverandør som ikke skiller dem, priser og planlegger</w:t>
-      </w:r>
-      <w:r>
-        <w:t xml:space="preserve"> </w:t>
-      </w:r>
-      <w:r>
-        <w:t xml:space="preserve">feil.</w:t>
+        <w:t xml:space="preserve">ulik karakter.</w:t>
       </w:r>
     </w:p>
     <w:bookmarkStart w:id="12" w:name="registrere-dette-er-jobben"/>
@@ -930,7 +930,7 @@
         <w:t xml:space="preserve"> </w:t>
       </w:r>
       <w:r>
-        <w:t xml:space="preserve">små.</w:t>
+        <w:t xml:space="preserve">enkle å levere.</w:t>
       </w:r>
     </w:p>
     <w:bookmarkEnd w:id="13"/>
@@ -4611,13 +4611,13 @@
         <w:pStyle w:val="BodyText"/>
       </w:pPr>
       <w:r>
-        <w:t xml:space="preserve">Dette er produktet en kommunikasjonsavdeling og en presselosje trenger uken</w:t>
-      </w:r>
-      <w:r>
-        <w:t xml:space="preserve"> </w:t>
-      </w:r>
-      <w:r>
-        <w:t xml:space="preserve">før et mesterskap, og som ingen rekker å lage manuelt. Vedlagt som vedlegg C.</w:t>
+        <w:t xml:space="preserve">Dette er produktet en kommunikasjonsavdeling og pressen trenger uken før et</w:t>
+      </w:r>
+      <w:r>
+        <w:t xml:space="preserve"> </w:t>
+      </w:r>
+      <w:r>
+        <w:t xml:space="preserve">mesterskap, og som ingen rekker å lage manuelt. Vedlagt som vedlegg C.</w:t>
       </w:r>
     </w:p>
     <w:bookmarkEnd w:id="36"/>
@@ -7768,13 +7768,13 @@
         <w:t xml:space="preserve"> </w:t>
       </w:r>
       <w:r>
-        <w:t xml:space="preserve">og idrettsdata, agentvirksomhet og trenervirksomhet. I tillegg leverer</w:t>
-      </w:r>
-      <w:r>
-        <w:t xml:space="preserve"> </w:t>
-      </w:r>
-      <w:r>
-        <w:t xml:space="preserve">selskapet laserbaserte måleprodukter for Athlete Mindset Inc.</w:t>
+        <w:t xml:space="preserve">og idrettsdata, agentvirksomhet og trenervirksomhet. I tillegg utvikler</w:t>
+      </w:r>
+      <w:r>
+        <w:t xml:space="preserve"> </w:t>
+      </w:r>
+      <w:r>
+        <w:t xml:space="preserve">selskapet laserbaserte måleprodukter sammen med Athlete Mindset Inc.</w:t>
       </w:r>
     </w:p>
     <w:p>
@@ -10770,7 +10770,7 @@
               <w:pStyle w:val="Compact"/>
             </w:pPr>
             <w:r>
-              <w:t xml:space="preserve">«Norsk friidrett 2013–2025», bredde- og rekrutteringsanalyse, lederrettet sammendrag</w:t>
+              <w:t xml:space="preserve">«Norsk friidrett 2013–2025», bredde- og rekrutteringsanalyse</w:t>
             </w:r>
           </w:p>
         </w:tc>
@@ -10798,7 +10798,7 @@
               <w:pStyle w:val="Compact"/>
             </w:pPr>
             <w:r>
-              <w:t xml:space="preserve">Veikart gateløp (utdypning av kapittel 5)</w:t>
+              <w:t xml:space="preserve">Spørsmål til NFIF: forutsetninger vi ber om å få bekreftet</w:t>
             </w:r>
           </w:p>
         </w:tc>
@@ -10816,34 +10816,6 @@
                 <w:bCs/>
               </w:rPr>
               <w:t xml:space="preserve">F</w:t>
-            </w:r>
-          </w:p>
-        </w:tc>
-        <w:tc>
-          <w:tcPr/>
-          <w:p>
-            <w:pPr>
-              <w:pStyle w:val="Compact"/>
-            </w:pPr>
-            <w:r>
-              <w:t xml:space="preserve">Spørsmål til NFIF: forutsetninger vi ber om å få bekreftet</w:t>
-            </w:r>
-          </w:p>
-        </w:tc>
-      </w:tr>
-      <w:tr>
-        <w:tc>
-          <w:tcPr/>
-          <w:p>
-            <w:pPr>
-              <w:pStyle w:val="Compact"/>
-            </w:pPr>
-            <w:r>
-              <w:rPr>
-                <w:b/>
-                <w:bCs/>
-              </w:rPr>
-              <w:t xml:space="preserve">G</w:t>
             </w:r>
           </w:p>
         </w:tc>

</xml_diff>

<commit_message>
Kjør breddeanalysen mot oppdatert base; oppdater tall i tilbudet
Deduplisering av utøvere gir litt lavere aktivtall (8 715 mot 8 745 i
2019). Nedgangen er uendret: 26,7 mot 26,6 prosent.

Toppnivået i 2013 ser derimot merkbart bedre ut nå, fordi den sesongen
var underimportert. 3000 m menn: 8:10,12 -> 8:06,23.
</commit_message>
<xml_diff>
--- a/NFIFProsjekt/tilbud/TILBUD.docx
+++ b/NFIFProsjekt/tilbud/TILBUD.docx
@@ -4641,13 +4641,13 @@
         <w:t xml:space="preserve"> </w:t>
       </w:r>
       <w:r>
-        <w:t xml:space="preserve">perioden. Sentralt funn: aktive utøvere i alderen 10–19 år falt fra 8 745 i</w:t>
-      </w:r>
-      <w:r>
-        <w:t xml:space="preserve"> </w:t>
-      </w:r>
-      <w:r>
-        <w:t xml:space="preserve">2019 til 6 418 i 2025, en nedgang på 27 prosent, nesten utelukkende</w:t>
+        <w:t xml:space="preserve">perioden. Sentralt funn: aktive utøvere i alderen 10–19 år falt fra 8 715 i</w:t>
+      </w:r>
+      <w:r>
+        <w:t xml:space="preserve"> </w:t>
+      </w:r>
+      <w:r>
+        <w:t xml:space="preserve">2019 til 6 392 i 2025, en nedgang på 27 prosent, nesten utelukkende</w:t>
       </w:r>
       <w:r>
         <w:t xml:space="preserve"> </w:t>

</xml_diff>

<commit_message>
Ta inn opplysninger fra utlysningen på friidrett.no
§14 var utdatert: Buypass-arbeidet med OpenTrack, FriRes og EQ Timing
pågår allerede, så plattformen skal ta imot enden av dataflyten, ikke
definere den.

Nytt 1.2 samler de fire anbefalingene våre ut over kravspekken, siden
utlysningen uttrykkelig ber om egne forslag.

8.1 anerkjenner at målsettingen er både bane og løp utenfor bane fra
01.01.2027.
</commit_message>
<xml_diff>
--- a/NFIFProsjekt/tilbud/TILBUD.docx
+++ b/NFIFProsjekt/tilbud/TILBUD.docx
@@ -734,7 +734,7 @@
       </w:r>
     </w:p>
     <w:bookmarkEnd w:id="11"/>
-    <w:bookmarkStart w:id="17" w:name="hva-vi-har-forstått-at-nfif-skal-løse"/>
+    <w:bookmarkStart w:id="18" w:name="hva-vi-har-forstått-at-nfif-skal-løse"/>
     <w:p>
       <w:pPr>
         <w:pStyle w:val="Heading1"/>
@@ -1018,13 +1018,13 @@
     </w:p>
     <w:bookmarkEnd w:id="14"/>
     <w:bookmarkEnd w:id="15"/>
-    <w:bookmarkStart w:id="16" w:name="X78d615b0e23688f1a0d547fb2bff190df6cc750"/>
+    <w:bookmarkStart w:id="16" w:name="X480653f79bf78cc1b6d26a4c67f98ac0915246a"/>
     <w:p>
       <w:pPr>
         <w:pStyle w:val="Heading2"/>
       </w:pPr>
       <w:r>
-        <w:t xml:space="preserve">1.2 Tre spørsmål avgjør hvem som får oppgaven</w:t>
+        <w:t xml:space="preserve">1.2 Fire anbefalinger ut over kravspesifikasjonen</w:t>
       </w:r>
     </w:p>
     <w:p>
@@ -1032,486 +1032,19 @@
         <w:pStyle w:val="FirstParagraph"/>
       </w:pPr>
       <w:r>
-        <w:t xml:space="preserve">Bak kravspesifikasjonen ligger tre spørsmål som avgjør om en leverandør er</w:t>
-      </w:r>
-      <w:r>
-        <w:t xml:space="preserve"> </w:t>
-      </w:r>
-      <w:r>
-        <w:t xml:space="preserve">riktig:</w:t>
-      </w:r>
-    </w:p>
-    <w:p>
-      <w:pPr>
-        <w:pStyle w:val="BodyText"/>
-      </w:pPr>
-      <w:r>
-        <w:rPr>
-          <w:b/>
-          <w:bCs/>
-        </w:rPr>
-        <w:t xml:space="preserve">Kan løsningen være i drift for alle baneresultater innen 01.01.2027?</w:t>
-      </w:r>
-      <w:r>
-        <w:t xml:space="preserve"> </w:t>
-      </w:r>
-      <w:r>
-        <w:t xml:space="preserve">Fra kontraktsinngåelse i september er det knapt fire måneder. En leverandør som</w:t>
-      </w:r>
-      <w:r>
-        <w:t xml:space="preserve"> </w:t>
-      </w:r>
-      <w:r>
-        <w:t xml:space="preserve">skal bygge plattformen og deretter migrere over 1,7 millioner resultater, rekker</w:t>
-      </w:r>
-      <w:r>
-        <w:t xml:space="preserve"> </w:t>
-      </w:r>
-      <w:r>
-        <w:t xml:space="preserve">det ikke. Vi er ferdige med migreringen. Se kapittel 8.</w:t>
-      </w:r>
-    </w:p>
-    <w:p>
-      <w:pPr>
-        <w:pStyle w:val="BodyText"/>
-      </w:pPr>
-      <w:r>
-        <w:rPr>
-          <w:b/>
-          <w:bCs/>
-        </w:rPr>
-        <w:t xml:space="preserve">Finnes leverandøren fortsatt i 2031?</w:t>
-      </w:r>
-      <w:r>
-        <w:t xml:space="preserve"> </w:t>
-      </w:r>
-      <w:r>
-        <w:t xml:space="preserve">§1 sier rett ut at dagens løsning ikke lar seg vedlikeholde med de frivillige</w:t>
-      </w:r>
-      <w:r>
-        <w:t xml:space="preserve"> </w:t>
-      </w:r>
-      <w:r>
-        <w:t xml:space="preserve">ressursene som finnes. NFIF er brent på personavhengighet, og skal ikke kjøpe</w:t>
-      </w:r>
-      <w:r>
-        <w:t xml:space="preserve"> </w:t>
-      </w:r>
-      <w:r>
-        <w:t xml:space="preserve">den på nytt i ny innpakning. Vi tar dette opp uoppfordret i kapittel 9, fordi</w:t>
-      </w:r>
-      <w:r>
-        <w:t xml:space="preserve"> </w:t>
-      </w:r>
-      <w:r>
-        <w:t xml:space="preserve">det er den innvendingen vi selv mener er mest berettiget.</w:t>
-      </w:r>
-    </w:p>
-    <w:p>
-      <w:pPr>
-        <w:pStyle w:val="BodyText"/>
-      </w:pPr>
-      <w:r>
-        <w:rPr>
-          <w:b/>
-          <w:bCs/>
-        </w:rPr>
-        <w:t xml:space="preserve">Hva koster det, og hva får forbundet igjen?</w:t>
-      </w:r>
-      <w:r>
-        <w:t xml:space="preserve"> </w:t>
-      </w:r>
-      <w:r>
-        <w:t xml:space="preserve">NFIF har drevet dette på dugnad i tretten år. Vi mener kostnaden må forsvares</w:t>
-      </w:r>
-      <w:r>
-        <w:t xml:space="preserve"> </w:t>
-      </w:r>
-      <w:r>
-        <w:t xml:space="preserve">med mer enn drift av en nettside, og har derfor bygget analysetjenesten inn i</w:t>
-      </w:r>
-      <w:r>
-        <w:t xml:space="preserve"> </w:t>
-      </w:r>
-      <w:r>
-        <w:t xml:space="preserve">grunnavtalen fremfor å selge den separat. Se kapittel 4 og 12.</w:t>
-      </w:r>
-    </w:p>
-    <w:p>
-      <w:pPr>
-        <w:pStyle w:val="BodyText"/>
-      </w:pPr>
-      <w:r>
-        <w:t xml:space="preserve">Dette dokumentet er strukturert etter disse spørsmålene, ikke etter</w:t>
-      </w:r>
-      <w:r>
-        <w:t xml:space="preserve"> </w:t>
-      </w:r>
-      <w:r>
-        <w:t xml:space="preserve">kravspekkens kapittelnummerering. Punkt-for-punkt-dekningen finnes i vedlegg A</w:t>
-      </w:r>
-      <w:r>
-        <w:t xml:space="preserve"> </w:t>
-      </w:r>
-      <w:r>
-        <w:t xml:space="preserve">og B.</w:t>
-      </w:r>
-    </w:p>
-    <w:p>
-      <w:r>
-        <w:pict>
-          <v:rect style="width:0;height:1.5pt" o:hralign="center" o:hrstd="t" o:hr="t"/>
-        </w:pict>
-      </w:r>
-    </w:p>
-    <w:bookmarkEnd w:id="16"/>
-    <w:bookmarkEnd w:id="17"/>
-    <w:bookmarkStart w:id="18" w:name="Xec4515533e3b563851d2e6a9d20c1c04ca06233"/>
-    <w:p>
-      <w:pPr>
-        <w:pStyle w:val="Heading1"/>
-      </w:pPr>
-      <w:r>
-        <w:t xml:space="preserve">2. Et konkret eksempel: NM-kvalifiseringslisten</w:t>
-      </w:r>
-    </w:p>
-    <w:p>
-      <w:pPr>
-        <w:pStyle w:val="FirstParagraph"/>
-      </w:pPr>
-      <w:r>
-        <w:t xml:space="preserve">Foran hvert NM sammenstiller SRU et regneark over alle som har klart</w:t>
-      </w:r>
-      <w:r>
-        <w:t xml:space="preserve"> </w:t>
-      </w:r>
-      <w:r>
-        <w:t xml:space="preserve">kvalifiseringskravet, og sender det til statistikkinteresserte. Utgaven for</w:t>
-      </w:r>
-      <w:r>
-        <w:t xml:space="preserve"> </w:t>
-      </w:r>
-      <w:r>
-        <w:t xml:space="preserve">2026 har 2 594 rader, 56 øvelsesblokker og 1 984 utøveroppføringer, med</w:t>
-      </w:r>
-      <w:r>
-        <w:t xml:space="preserve"> </w:t>
-      </w:r>
-      <w:r>
-        <w:t xml:space="preserve">kravsatser og deltakertall tilbake til 2002. Kvaliteten er høy, og arbeidet</w:t>
-      </w:r>
-      <w:r>
-        <w:t xml:space="preserve"> </w:t>
-      </w:r>
-      <w:r>
-        <w:t xml:space="preserve">fortjener respekt.</w:t>
-      </w:r>
-    </w:p>
-    <w:p>
-      <w:pPr>
-        <w:pStyle w:val="BodyText"/>
-      </w:pPr>
-      <w:r>
-        <w:t xml:space="preserve">Det er også en presis illustrasjon av §1: en verdifull funksjon som hviler på</w:t>
-      </w:r>
-      <w:r>
-        <w:t xml:space="preserve"> </w:t>
-      </w:r>
-      <w:r>
-        <w:t xml:space="preserve">frivillige ressurser, vedlikeholdes manuelt, og er utdatert i det øyeblikket</w:t>
-      </w:r>
-      <w:r>
-        <w:t xml:space="preserve"> </w:t>
-      </w:r>
-      <w:r>
-        <w:t xml:space="preserve">neste stevne er ferdig.</w:t>
-      </w:r>
-    </w:p>
-    <w:p>
-      <w:pPr>
-        <w:pStyle w:val="BodyText"/>
-      </w:pPr>
-      <w:r>
-        <w:rPr>
-          <w:b/>
-          <w:bCs/>
-        </w:rPr>
-        <w:t xml:space="preserve">Vi har bygget den automatiske versjonen.</w:t>
-      </w:r>
-      <w:r>
-        <w:t xml:space="preserve"> </w:t>
-      </w:r>
-      <w:r>
-        <w:t xml:space="preserve">Kvalifiseringsreglene fra</w:t>
-      </w:r>
-      <w:r>
-        <w:t xml:space="preserve"> </w:t>
-      </w:r>
-      <w:r>
-        <w:rPr>
-          <w:i/>
-          <w:iCs/>
-        </w:rPr>
-        <w:t xml:space="preserve">Reglement for norske mesterskap 2026</w:t>
-      </w:r>
-      <w:r>
-        <w:t xml:space="preserve"> </w:t>
-      </w:r>
-      <w:r>
-        <w:t xml:space="preserve">er implementert: kravsatser per øvelse</w:t>
-      </w:r>
-      <w:r>
-        <w:t xml:space="preserve"> </w:t>
-      </w:r>
-      <w:r>
-        <w:t xml:space="preserve">og kjønn, aldersklasseoverstyringer for U20 og U23, regler for</w:t>
-      </w:r>
-      <w:r>
-        <w:t xml:space="preserve"> </w:t>
-      </w:r>
-      <w:r>
-        <w:t xml:space="preserve">innendørsresultater, og øvelser som kvalifiserer til andre øvelser, som 5 km</w:t>
-      </w:r>
-      <w:r>
-        <w:t xml:space="preserve"> </w:t>
-      </w:r>
-      <w:r>
-        <w:t xml:space="preserve">gateløp til 5000 m. Sidene</w:t>
-      </w:r>
-      <w:r>
-        <w:t xml:space="preserve"> </w:t>
-      </w:r>
-      <w:r>
-        <w:rPr>
-          <w:rStyle w:val="VerbatimChar"/>
-        </w:rPr>
-        <w:t xml:space="preserve">/mesterskap</w:t>
-      </w:r>
-      <w:r>
-        <w:t xml:space="preserve"> </w:t>
-      </w:r>
-      <w:r>
-        <w:t xml:space="preserve">er i drift.</w:t>
-      </w:r>
-    </w:p>
-    <w:p>
-      <w:pPr>
-        <w:pStyle w:val="BodyText"/>
-      </w:pPr>
-      <w:r>
-        <w:rPr>
-          <w:b/>
-          <w:bCs/>
-        </w:rPr>
-        <w:t xml:space="preserve">Vi testet den mot regnearket.</w:t>
-      </w:r>
-      <w:r>
-        <w:t xml:space="preserve"> </w:t>
-      </w:r>
-      <w:r>
-        <w:t xml:space="preserve">100 meter kvinner, krav 12,80. Regnearket</w:t>
-      </w:r>
-      <w:r>
-        <w:t xml:space="preserve"> </w:t>
-      </w:r>
-      <w:r>
-        <w:t xml:space="preserve">har 101 utøvere, vår base finner 97, og</w:t>
-      </w:r>
-      <w:r>
-        <w:t xml:space="preserve"> </w:t>
-      </w:r>
-      <w:r>
-        <w:rPr>
-          <w:b/>
-          <w:bCs/>
-        </w:rPr>
-        <w:t xml:space="preserve">89 navn er de samme.</w:t>
-      </w:r>
-      <w:r>
-        <w:t xml:space="preserve"> </w:t>
-      </w:r>
-      <w:r>
-        <w:t xml:space="preserve">Avvikene</w:t>
-      </w:r>
-      <w:r>
-        <w:t xml:space="preserve"> </w:t>
-      </w:r>
-      <w:r>
-        <w:t xml:space="preserve">skyldes i hovedsak ikke feil i noen av listene, men nettopp det</w:t>
-      </w:r>
-      <w:r>
-        <w:t xml:space="preserve"> </w:t>
-      </w:r>
-      <w:r>
-        <w:t xml:space="preserve">kravspesifikasjonen ber plattformen håndtere: navnevarianter, en utøver som</w:t>
-      </w:r>
-      <w:r>
-        <w:t xml:space="preserve"> </w:t>
-      </w:r>
-      <w:r>
-        <w:t xml:space="preserve">har byttet navn, en utenlandsk utøver i norsk klubb, og ulik anvendelse av</w:t>
-      </w:r>
-      <w:r>
-        <w:t xml:space="preserve"> </w:t>
-      </w:r>
-      <w:r>
-        <w:t xml:space="preserve">aldersgrensen. Dette er §9 og §7 i praksis, og samtidig en ekstern validering</w:t>
-      </w:r>
-      <w:r>
-        <w:t xml:space="preserve"> </w:t>
-      </w:r>
-      <w:r>
-        <w:t xml:space="preserve">av datakvaliteten som vi ikke kunne gitt oss selv.</w:t>
-      </w:r>
-    </w:p>
-    <w:p>
-      <w:pPr>
-        <w:pStyle w:val="BodyText"/>
-      </w:pPr>
-      <w:r>
-        <w:t xml:space="preserve">Med plattformen oppdateres status i det resultatet importeres, i stedet for</w:t>
-      </w:r>
-      <w:r>
-        <w:t xml:space="preserve"> </w:t>
-      </w:r>
-      <w:r>
-        <w:t xml:space="preserve">noen ganger i året. Utøveren ser på egen profil hva hun er kvalifisert i,</w:t>
-      </w:r>
-      <w:r>
-        <w:t xml:space="preserve"> </w:t>
-      </w:r>
-      <w:r>
-        <w:t xml:space="preserve">klubbsiden viser klubbens kvalifiserte, hvert resultat lenker til stevnet det</w:t>
-      </w:r>
-      <w:r>
-        <w:t xml:space="preserve"> </w:t>
-      </w:r>
-      <w:r>
-        <w:t xml:space="preserve">ble oppnådd i, og kravsatser og deltakertall 2002–2026 blir en varig tidsserie</w:t>
-      </w:r>
-      <w:r>
-        <w:t xml:space="preserve"> </w:t>
-      </w:r>
-      <w:r>
-        <w:t xml:space="preserve">i stedet for en fil. Eksport til Excel i det formatet miljøet kjenner blir en</w:t>
-      </w:r>
-      <w:r>
-        <w:t xml:space="preserve"> </w:t>
-      </w:r>
-      <w:r>
-        <w:t xml:space="preserve">nedlasting i stedet for en jobb.</w:t>
-      </w:r>
-    </w:p>
-    <w:p>
-      <w:pPr>
-        <w:pStyle w:val="BodyText"/>
-      </w:pPr>
-      <w:r>
-        <w:rPr>
-          <w:b/>
-          <w:bCs/>
-        </w:rPr>
-        <w:t xml:space="preserve">Konsekvensen av å endre et krav kan dessuten beregnes på forhånd.</w:t>
-      </w:r>
-      <w:r>
-        <w:t xml:space="preserve"> </w:t>
-      </w:r>
-      <w:r>
-        <w:t xml:space="preserve">Regnearket dokumenterer selv at NFIFs styre justerte kvalifiseringskravene i</w:t>
-      </w:r>
-      <w:r>
-        <w:t xml:space="preserve"> </w:t>
-      </w:r>
-      <w:r>
-        <w:t xml:space="preserve">2023. Slike vedtak fattes i dag uten mulighet til å regne på virkningen.</w:t>
-      </w:r>
-    </w:p>
-    <w:p>
-      <w:pPr>
-        <w:pStyle w:val="BodyText"/>
-      </w:pPr>
-      <w:r>
-        <w:rPr>
-          <w:b/>
-          <w:bCs/>
-        </w:rPr>
-        <w:t xml:space="preserve">Én presisering:</w:t>
-      </w:r>
-      <w:r>
-        <w:t xml:space="preserve"> </w:t>
-      </w:r>
-      <w:r>
-        <w:t xml:space="preserve">vi skal ikke erstatte det arbeidet SRU gjør, men fjerne det</w:t>
-      </w:r>
-      <w:r>
-        <w:t xml:space="preserve"> </w:t>
-      </w:r>
-      <w:r>
-        <w:t xml:space="preserve">manuelle i det. Regelverket og de faglige vurderingene skal fortsatt eies av</w:t>
-      </w:r>
-      <w:r>
-        <w:t xml:space="preserve"> </w:t>
-      </w:r>
-      <w:r>
-        <w:t xml:space="preserve">SRU, og vi foreslår at SRU får en definert rolle som fagansvarlig for regelverk</w:t>
-      </w:r>
-      <w:r>
-        <w:t xml:space="preserve"> </w:t>
-      </w:r>
-      <w:r>
-        <w:t xml:space="preserve">i løsningen. Plattformen gjør innsamlingen, sammenstillingen og distribusjonen.</w:t>
-      </w:r>
-    </w:p>
-    <w:p>
-      <w:r>
-        <w:pict>
-          <v:rect style="width:0;height:1.5pt" o:hralign="center" o:hrstd="t" o:hr="t"/>
-        </w:pict>
-      </w:r>
-    </w:p>
-    <w:bookmarkEnd w:id="18"/>
-    <w:bookmarkStart w:id="35" w:name="teknisk-løsning"/>
-    <w:p>
-      <w:pPr>
-        <w:pStyle w:val="Heading1"/>
-      </w:pPr>
-      <w:r>
-        <w:t xml:space="preserve">3. Teknisk løsning</w:t>
-      </w:r>
-    </w:p>
-    <w:p>
-      <w:pPr>
-        <w:pStyle w:val="FirstParagraph"/>
-      </w:pPr>
-      <w:r>
-        <w:rPr>
-          <w:i/>
-          <w:iCs/>
-        </w:rPr>
-        <w:t xml:space="preserve">Besvarer §21: teknisk løsning, datamodell, integrasjonsløsning,</w:t>
-      </w:r>
-      <w:r>
-        <w:rPr>
-          <w:i/>
-          <w:iCs/>
-        </w:rPr>
-        <w:t xml:space="preserve"> </w:t>
-      </w:r>
-      <w:r>
-        <w:rPr>
-          <w:i/>
-          <w:iCs/>
-        </w:rPr>
-        <w:t xml:space="preserve">brukergrensesnitt.</w:t>
-      </w:r>
-    </w:p>
-    <w:bookmarkStart w:id="19" w:name="arkitektur"/>
-    <w:p>
-      <w:pPr>
-        <w:pStyle w:val="Heading2"/>
-      </w:pPr>
-      <w:r>
-        <w:t xml:space="preserve">3.1 Arkitektur</w:t>
+        <w:t xml:space="preserve">Invitasjonen ber leverandørene om å komme med egne forslag og anbefalinger til</w:t>
+      </w:r>
+      <w:r>
+        <w:t xml:space="preserve"> </w:t>
+      </w:r>
+      <w:r>
+        <w:t xml:space="preserve">hvordan løsningen best kan utvikles. Vi har fire, og de er innarbeidet i</w:t>
+      </w:r>
+      <w:r>
+        <w:t xml:space="preserve"> </w:t>
+      </w:r>
+      <w:r>
+        <w:t xml:space="preserve">tilbudet framfor å stå som et vedheng:</w:t>
       </w:r>
     </w:p>
     <w:tbl>
@@ -1537,6 +1070,710 @@
               <w:pStyle w:val="Compact"/>
             </w:pPr>
             <w:r>
+              <w:t xml:space="preserve">Anbefaling</w:t>
+            </w:r>
+          </w:p>
+        </w:tc>
+        <w:tc>
+          <w:tcPr/>
+          <w:p>
+            <w:pPr>
+              <w:pStyle w:val="Compact"/>
+            </w:pPr>
+            <w:r>
+              <w:t xml:space="preserve">Hvorfor</w:t>
+            </w:r>
+          </w:p>
+        </w:tc>
+        <w:tc>
+          <w:tcPr/>
+          <w:p>
+            <w:pPr>
+              <w:pStyle w:val="Compact"/>
+            </w:pPr>
+            <w:r>
+              <w:t xml:space="preserve">Hvor</w:t>
+            </w:r>
+          </w:p>
+        </w:tc>
+      </w:tr>
+      <w:tr>
+        <w:tc>
+          <w:tcPr/>
+          <w:p>
+            <w:pPr>
+              <w:pStyle w:val="Compact"/>
+            </w:pPr>
+            <w:r>
+              <w:rPr>
+                <w:b/>
+                <w:bCs/>
+              </w:rPr>
+              <w:t xml:space="preserve">Universell utforming etter WCAG 2.1 AA</w:t>
+            </w:r>
+          </w:p>
+        </w:tc>
+        <w:tc>
+          <w:tcPr/>
+          <w:p>
+            <w:pPr>
+              <w:pStyle w:val="Compact"/>
+            </w:pPr>
+            <w:r>
+              <w:t xml:space="preserve">Lovkrav for publikumsrettede norske nettsteder. §17 nevner bare skjermstørrelser.</w:t>
+            </w:r>
+          </w:p>
+        </w:tc>
+        <w:tc>
+          <w:tcPr/>
+          <w:p>
+            <w:pPr>
+              <w:pStyle w:val="Compact"/>
+            </w:pPr>
+            <w:r>
+              <w:t xml:space="preserve">3.3</w:t>
+            </w:r>
+          </w:p>
+        </w:tc>
+      </w:tr>
+      <w:tr>
+        <w:tc>
+          <w:tcPr/>
+          <w:p>
+            <w:pPr>
+              <w:pStyle w:val="Compact"/>
+            </w:pPr>
+            <w:r>
+              <w:rPr>
+                <w:b/>
+                <w:bCs/>
+              </w:rPr>
+              <w:t xml:space="preserve">Skillet mellom lagring og eksponering av barns data bygges i datamodellen</w:t>
+            </w:r>
+          </w:p>
+        </w:tc>
+        <w:tc>
+          <w:tcPr/>
+          <w:p>
+            <w:pPr>
+              <w:pStyle w:val="Compact"/>
+            </w:pPr>
+            <w:r>
+              <w:t xml:space="preserve">Resultatlistene har navn ned til syvårsalderen. Skjuling i grensesnittet er ikke nok.</w:t>
+            </w:r>
+          </w:p>
+        </w:tc>
+        <w:tc>
+          <w:tcPr/>
+          <w:p>
+            <w:pPr>
+              <w:pStyle w:val="Compact"/>
+            </w:pPr>
+            <w:r>
+              <w:t xml:space="preserve">7.1</w:t>
+            </w:r>
+          </w:p>
+        </w:tc>
+      </w:tr>
+      <w:tr>
+        <w:tc>
+          <w:tcPr/>
+          <w:p>
+            <w:pPr>
+              <w:pStyle w:val="Compact"/>
+            </w:pPr>
+            <w:r>
+              <w:rPr>
+                <w:b/>
+                <w:bCs/>
+              </w:rPr>
+              <w:t xml:space="preserve">Regelsimulering før vedtak</w:t>
+            </w:r>
+          </w:p>
+        </w:tc>
+        <w:tc>
+          <w:tcPr/>
+          <w:p>
+            <w:pPr>
+              <w:pStyle w:val="Compact"/>
+            </w:pPr>
+            <w:r>
+              <w:t xml:space="preserve">Konsekvensen av å endre et kvalifiseringskrav eller en klasseinndeling kan beregnes på forhånd i stedet for å observeres to år etter.</w:t>
+            </w:r>
+          </w:p>
+        </w:tc>
+        <w:tc>
+          <w:tcPr/>
+          <w:p>
+            <w:pPr>
+              <w:pStyle w:val="Compact"/>
+            </w:pPr>
+            <w:r>
+              <w:t xml:space="preserve">2</w:t>
+            </w:r>
+          </w:p>
+        </w:tc>
+      </w:tr>
+      <w:tr>
+        <w:tc>
+          <w:tcPr/>
+          <w:p>
+            <w:pPr>
+              <w:pStyle w:val="Compact"/>
+            </w:pPr>
+            <w:r>
+              <w:rPr>
+                <w:b/>
+                <w:bCs/>
+              </w:rPr>
+              <w:t xml:space="preserve">Analyse som del av grunnavtalen</w:t>
+            </w:r>
+          </w:p>
+        </w:tc>
+        <w:tc>
+          <w:tcPr/>
+          <w:p>
+            <w:pPr>
+              <w:pStyle w:val="Compact"/>
+            </w:pPr>
+            <w:r>
+              <w:t xml:space="preserve">Aktivitetsdata i §12 blir først nyttige når noen leser dem. Vi legger to mesterskapspakker og en årsrapport inn i driftsprisen.</w:t>
+            </w:r>
+          </w:p>
+        </w:tc>
+        <w:tc>
+          <w:tcPr/>
+          <w:p>
+            <w:pPr>
+              <w:pStyle w:val="Compact"/>
+            </w:pPr>
+            <w:r>
+              <w:t xml:space="preserve">4</w:t>
+            </w:r>
+          </w:p>
+        </w:tc>
+      </w:tr>
+    </w:tbl>
+    <w:bookmarkEnd w:id="16"/>
+    <w:bookmarkStart w:id="17" w:name="X78d615b0e23688f1a0d547fb2bff190df6cc750"/>
+    <w:p>
+      <w:pPr>
+        <w:pStyle w:val="Heading2"/>
+      </w:pPr>
+      <w:r>
+        <w:t xml:space="preserve">1.3 Tre spørsmål avgjør hvem som får oppgaven</w:t>
+      </w:r>
+    </w:p>
+    <w:p>
+      <w:pPr>
+        <w:pStyle w:val="FirstParagraph"/>
+      </w:pPr>
+      <w:r>
+        <w:t xml:space="preserve">Bak kravspesifikasjonen ligger tre spørsmål som avgjør om en leverandør er</w:t>
+      </w:r>
+      <w:r>
+        <w:t xml:space="preserve"> </w:t>
+      </w:r>
+      <w:r>
+        <w:t xml:space="preserve">riktig:</w:t>
+      </w:r>
+    </w:p>
+    <w:p>
+      <w:pPr>
+        <w:pStyle w:val="BodyText"/>
+      </w:pPr>
+      <w:r>
+        <w:rPr>
+          <w:b/>
+          <w:bCs/>
+        </w:rPr>
+        <w:t xml:space="preserve">Kan løsningen være i drift for alle baneresultater innen 01.01.2027?</w:t>
+      </w:r>
+      <w:r>
+        <w:t xml:space="preserve"> </w:t>
+      </w:r>
+      <w:r>
+        <w:t xml:space="preserve">Fra kontraktsinngåelse i september er det knapt fire måneder. En leverandør som</w:t>
+      </w:r>
+      <w:r>
+        <w:t xml:space="preserve"> </w:t>
+      </w:r>
+      <w:r>
+        <w:t xml:space="preserve">skal bygge plattformen og deretter migrere over 1,7 millioner resultater, rekker</w:t>
+      </w:r>
+      <w:r>
+        <w:t xml:space="preserve"> </w:t>
+      </w:r>
+      <w:r>
+        <w:t xml:space="preserve">det ikke. Vi er ferdige med migreringen. Se kapittel 8.</w:t>
+      </w:r>
+    </w:p>
+    <w:p>
+      <w:pPr>
+        <w:pStyle w:val="BodyText"/>
+      </w:pPr>
+      <w:r>
+        <w:rPr>
+          <w:b/>
+          <w:bCs/>
+        </w:rPr>
+        <w:t xml:space="preserve">Finnes leverandøren fortsatt i 2031?</w:t>
+      </w:r>
+      <w:r>
+        <w:t xml:space="preserve"> </w:t>
+      </w:r>
+      <w:r>
+        <w:t xml:space="preserve">§1 sier rett ut at dagens løsning ikke lar seg vedlikeholde med de frivillige</w:t>
+      </w:r>
+      <w:r>
+        <w:t xml:space="preserve"> </w:t>
+      </w:r>
+      <w:r>
+        <w:t xml:space="preserve">ressursene som finnes. NFIF er brent på personavhengighet, og skal ikke kjøpe</w:t>
+      </w:r>
+      <w:r>
+        <w:t xml:space="preserve"> </w:t>
+      </w:r>
+      <w:r>
+        <w:t xml:space="preserve">den på nytt i ny innpakning. Vi tar dette opp uoppfordret i kapittel 9, fordi</w:t>
+      </w:r>
+      <w:r>
+        <w:t xml:space="preserve"> </w:t>
+      </w:r>
+      <w:r>
+        <w:t xml:space="preserve">det er den innvendingen vi selv mener er mest berettiget.</w:t>
+      </w:r>
+    </w:p>
+    <w:p>
+      <w:pPr>
+        <w:pStyle w:val="BodyText"/>
+      </w:pPr>
+      <w:r>
+        <w:rPr>
+          <w:b/>
+          <w:bCs/>
+        </w:rPr>
+        <w:t xml:space="preserve">Hva koster det, og hva får forbundet igjen?</w:t>
+      </w:r>
+      <w:r>
+        <w:t xml:space="preserve"> </w:t>
+      </w:r>
+      <w:r>
+        <w:t xml:space="preserve">NFIF har drevet dette på dugnad i tretten år. Vi mener kostnaden må forsvares</w:t>
+      </w:r>
+      <w:r>
+        <w:t xml:space="preserve"> </w:t>
+      </w:r>
+      <w:r>
+        <w:t xml:space="preserve">med mer enn drift av en nettside, og har derfor bygget analysetjenesten inn i</w:t>
+      </w:r>
+      <w:r>
+        <w:t xml:space="preserve"> </w:t>
+      </w:r>
+      <w:r>
+        <w:t xml:space="preserve">grunnavtalen fremfor å selge den separat. Se kapittel 4 og 12.</w:t>
+      </w:r>
+    </w:p>
+    <w:p>
+      <w:pPr>
+        <w:pStyle w:val="BodyText"/>
+      </w:pPr>
+      <w:r>
+        <w:t xml:space="preserve">Dette dokumentet er strukturert etter disse spørsmålene, ikke etter</w:t>
+      </w:r>
+      <w:r>
+        <w:t xml:space="preserve"> </w:t>
+      </w:r>
+      <w:r>
+        <w:t xml:space="preserve">kravspekkens kapittelnummerering. Punkt-for-punkt-dekningen finnes i vedlegg A</w:t>
+      </w:r>
+      <w:r>
+        <w:t xml:space="preserve"> </w:t>
+      </w:r>
+      <w:r>
+        <w:t xml:space="preserve">og B.</w:t>
+      </w:r>
+    </w:p>
+    <w:p>
+      <w:r>
+        <w:pict>
+          <v:rect style="width:0;height:1.5pt" o:hralign="center" o:hrstd="t" o:hr="t"/>
+        </w:pict>
+      </w:r>
+    </w:p>
+    <w:bookmarkEnd w:id="17"/>
+    <w:bookmarkEnd w:id="18"/>
+    <w:bookmarkStart w:id="19" w:name="Xec4515533e3b563851d2e6a9d20c1c04ca06233"/>
+    <w:p>
+      <w:pPr>
+        <w:pStyle w:val="Heading1"/>
+      </w:pPr>
+      <w:r>
+        <w:t xml:space="preserve">2. Et konkret eksempel: NM-kvalifiseringslisten</w:t>
+      </w:r>
+    </w:p>
+    <w:p>
+      <w:pPr>
+        <w:pStyle w:val="FirstParagraph"/>
+      </w:pPr>
+      <w:r>
+        <w:t xml:space="preserve">Foran hvert NM sammenstiller SRU et regneark over alle som har klart</w:t>
+      </w:r>
+      <w:r>
+        <w:t xml:space="preserve"> </w:t>
+      </w:r>
+      <w:r>
+        <w:t xml:space="preserve">kvalifiseringskravet, og sender det til statistikkinteresserte. Utgaven for</w:t>
+      </w:r>
+      <w:r>
+        <w:t xml:space="preserve"> </w:t>
+      </w:r>
+      <w:r>
+        <w:t xml:space="preserve">2026 har 2 594 rader, 56 øvelsesblokker og 1 984 utøveroppføringer, med</w:t>
+      </w:r>
+      <w:r>
+        <w:t xml:space="preserve"> </w:t>
+      </w:r>
+      <w:r>
+        <w:t xml:space="preserve">kravsatser og deltakertall tilbake til 2002. Kvaliteten er høy, og arbeidet</w:t>
+      </w:r>
+      <w:r>
+        <w:t xml:space="preserve"> </w:t>
+      </w:r>
+      <w:r>
+        <w:t xml:space="preserve">fortjener respekt.</w:t>
+      </w:r>
+    </w:p>
+    <w:p>
+      <w:pPr>
+        <w:pStyle w:val="BodyText"/>
+      </w:pPr>
+      <w:r>
+        <w:t xml:space="preserve">Det er også en presis illustrasjon av §1: en verdifull funksjon som hviler på</w:t>
+      </w:r>
+      <w:r>
+        <w:t xml:space="preserve"> </w:t>
+      </w:r>
+      <w:r>
+        <w:t xml:space="preserve">frivillige ressurser, vedlikeholdes manuelt, og er utdatert i det øyeblikket</w:t>
+      </w:r>
+      <w:r>
+        <w:t xml:space="preserve"> </w:t>
+      </w:r>
+      <w:r>
+        <w:t xml:space="preserve">neste stevne er ferdig.</w:t>
+      </w:r>
+    </w:p>
+    <w:p>
+      <w:pPr>
+        <w:pStyle w:val="BodyText"/>
+      </w:pPr>
+      <w:r>
+        <w:rPr>
+          <w:b/>
+          <w:bCs/>
+        </w:rPr>
+        <w:t xml:space="preserve">Vi har bygget den automatiske versjonen.</w:t>
+      </w:r>
+      <w:r>
+        <w:t xml:space="preserve"> </w:t>
+      </w:r>
+      <w:r>
+        <w:t xml:space="preserve">Kvalifiseringsreglene fra</w:t>
+      </w:r>
+      <w:r>
+        <w:t xml:space="preserve"> </w:t>
+      </w:r>
+      <w:r>
+        <w:rPr>
+          <w:i/>
+          <w:iCs/>
+        </w:rPr>
+        <w:t xml:space="preserve">Reglement for norske mesterskap 2026</w:t>
+      </w:r>
+      <w:r>
+        <w:t xml:space="preserve"> </w:t>
+      </w:r>
+      <w:r>
+        <w:t xml:space="preserve">er implementert: kravsatser per øvelse</w:t>
+      </w:r>
+      <w:r>
+        <w:t xml:space="preserve"> </w:t>
+      </w:r>
+      <w:r>
+        <w:t xml:space="preserve">og kjønn, aldersklasseoverstyringer for U20 og U23, regler for</w:t>
+      </w:r>
+      <w:r>
+        <w:t xml:space="preserve"> </w:t>
+      </w:r>
+      <w:r>
+        <w:t xml:space="preserve">innendørsresultater, og øvelser som kvalifiserer til andre øvelser, som 5 km</w:t>
+      </w:r>
+      <w:r>
+        <w:t xml:space="preserve"> </w:t>
+      </w:r>
+      <w:r>
+        <w:t xml:space="preserve">gateløp til 5000 m. Sidene</w:t>
+      </w:r>
+      <w:r>
+        <w:t xml:space="preserve"> </w:t>
+      </w:r>
+      <w:r>
+        <w:rPr>
+          <w:rStyle w:val="VerbatimChar"/>
+        </w:rPr>
+        <w:t xml:space="preserve">/mesterskap</w:t>
+      </w:r>
+      <w:r>
+        <w:t xml:space="preserve"> </w:t>
+      </w:r>
+      <w:r>
+        <w:t xml:space="preserve">er i drift.</w:t>
+      </w:r>
+    </w:p>
+    <w:p>
+      <w:pPr>
+        <w:pStyle w:val="BodyText"/>
+      </w:pPr>
+      <w:r>
+        <w:rPr>
+          <w:b/>
+          <w:bCs/>
+        </w:rPr>
+        <w:t xml:space="preserve">Vi testet den mot regnearket.</w:t>
+      </w:r>
+      <w:r>
+        <w:t xml:space="preserve"> </w:t>
+      </w:r>
+      <w:r>
+        <w:t xml:space="preserve">100 meter kvinner, krav 12,80. Regnearket</w:t>
+      </w:r>
+      <w:r>
+        <w:t xml:space="preserve"> </w:t>
+      </w:r>
+      <w:r>
+        <w:t xml:space="preserve">har 101 utøvere, vår base finner 97, og</w:t>
+      </w:r>
+      <w:r>
+        <w:t xml:space="preserve"> </w:t>
+      </w:r>
+      <w:r>
+        <w:rPr>
+          <w:b/>
+          <w:bCs/>
+        </w:rPr>
+        <w:t xml:space="preserve">89 navn er de samme.</w:t>
+      </w:r>
+      <w:r>
+        <w:t xml:space="preserve"> </w:t>
+      </w:r>
+      <w:r>
+        <w:t xml:space="preserve">Avvikene</w:t>
+      </w:r>
+      <w:r>
+        <w:t xml:space="preserve"> </w:t>
+      </w:r>
+      <w:r>
+        <w:t xml:space="preserve">skyldes i hovedsak ikke feil i noen av listene, men nettopp det</w:t>
+      </w:r>
+      <w:r>
+        <w:t xml:space="preserve"> </w:t>
+      </w:r>
+      <w:r>
+        <w:t xml:space="preserve">kravspesifikasjonen ber plattformen håndtere: navnevarianter, en utøver som</w:t>
+      </w:r>
+      <w:r>
+        <w:t xml:space="preserve"> </w:t>
+      </w:r>
+      <w:r>
+        <w:t xml:space="preserve">har byttet navn, en utenlandsk utøver i norsk klubb, og ulik anvendelse av</w:t>
+      </w:r>
+      <w:r>
+        <w:t xml:space="preserve"> </w:t>
+      </w:r>
+      <w:r>
+        <w:t xml:space="preserve">aldersgrensen. Dette er §9 og §7 i praksis, og samtidig en ekstern validering</w:t>
+      </w:r>
+      <w:r>
+        <w:t xml:space="preserve"> </w:t>
+      </w:r>
+      <w:r>
+        <w:t xml:space="preserve">av datakvaliteten som vi ikke kunne gitt oss selv.</w:t>
+      </w:r>
+    </w:p>
+    <w:p>
+      <w:pPr>
+        <w:pStyle w:val="BodyText"/>
+      </w:pPr>
+      <w:r>
+        <w:t xml:space="preserve">Med plattformen oppdateres status i det resultatet importeres, i stedet for</w:t>
+      </w:r>
+      <w:r>
+        <w:t xml:space="preserve"> </w:t>
+      </w:r>
+      <w:r>
+        <w:t xml:space="preserve">noen ganger i året. Utøveren ser på egen profil hva hun er kvalifisert i,</w:t>
+      </w:r>
+      <w:r>
+        <w:t xml:space="preserve"> </w:t>
+      </w:r>
+      <w:r>
+        <w:t xml:space="preserve">klubbsiden viser klubbens kvalifiserte, hvert resultat lenker til stevnet det</w:t>
+      </w:r>
+      <w:r>
+        <w:t xml:space="preserve"> </w:t>
+      </w:r>
+      <w:r>
+        <w:t xml:space="preserve">ble oppnådd i, og kravsatser og deltakertall 2002–2026 blir en varig tidsserie</w:t>
+      </w:r>
+      <w:r>
+        <w:t xml:space="preserve"> </w:t>
+      </w:r>
+      <w:r>
+        <w:t xml:space="preserve">i stedet for en fil. Eksport til Excel i det formatet miljøet kjenner blir en</w:t>
+      </w:r>
+      <w:r>
+        <w:t xml:space="preserve"> </w:t>
+      </w:r>
+      <w:r>
+        <w:t xml:space="preserve">nedlasting i stedet for en jobb.</w:t>
+      </w:r>
+    </w:p>
+    <w:p>
+      <w:pPr>
+        <w:pStyle w:val="BodyText"/>
+      </w:pPr>
+      <w:r>
+        <w:rPr>
+          <w:b/>
+          <w:bCs/>
+        </w:rPr>
+        <w:t xml:space="preserve">Konsekvensen av å endre et krav kan dessuten beregnes på forhånd.</w:t>
+      </w:r>
+      <w:r>
+        <w:t xml:space="preserve"> </w:t>
+      </w:r>
+      <w:r>
+        <w:t xml:space="preserve">Regnearket dokumenterer selv at NFIFs styre justerte kvalifiseringskravene i</w:t>
+      </w:r>
+      <w:r>
+        <w:t xml:space="preserve"> </w:t>
+      </w:r>
+      <w:r>
+        <w:t xml:space="preserve">2023. Slike vedtak fattes i dag uten mulighet til å regne på virkningen.</w:t>
+      </w:r>
+    </w:p>
+    <w:p>
+      <w:pPr>
+        <w:pStyle w:val="BodyText"/>
+      </w:pPr>
+      <w:r>
+        <w:rPr>
+          <w:b/>
+          <w:bCs/>
+        </w:rPr>
+        <w:t xml:space="preserve">Én presisering:</w:t>
+      </w:r>
+      <w:r>
+        <w:t xml:space="preserve"> </w:t>
+      </w:r>
+      <w:r>
+        <w:t xml:space="preserve">vi skal ikke erstatte det arbeidet SRU gjør, men fjerne det</w:t>
+      </w:r>
+      <w:r>
+        <w:t xml:space="preserve"> </w:t>
+      </w:r>
+      <w:r>
+        <w:t xml:space="preserve">manuelle i det. Regelverket og de faglige vurderingene skal fortsatt eies av</w:t>
+      </w:r>
+      <w:r>
+        <w:t xml:space="preserve"> </w:t>
+      </w:r>
+      <w:r>
+        <w:t xml:space="preserve">SRU, og vi foreslår at SRU får en definert rolle som fagansvarlig for regelverk</w:t>
+      </w:r>
+      <w:r>
+        <w:t xml:space="preserve"> </w:t>
+      </w:r>
+      <w:r>
+        <w:t xml:space="preserve">i løsningen. Plattformen gjør innsamlingen, sammenstillingen og distribusjonen.</w:t>
+      </w:r>
+    </w:p>
+    <w:p>
+      <w:r>
+        <w:pict>
+          <v:rect style="width:0;height:1.5pt" o:hralign="center" o:hrstd="t" o:hr="t"/>
+        </w:pict>
+      </w:r>
+    </w:p>
+    <w:bookmarkEnd w:id="19"/>
+    <w:bookmarkStart w:id="36" w:name="teknisk-løsning"/>
+    <w:p>
+      <w:pPr>
+        <w:pStyle w:val="Heading1"/>
+      </w:pPr>
+      <w:r>
+        <w:t xml:space="preserve">3. Teknisk løsning</w:t>
+      </w:r>
+    </w:p>
+    <w:p>
+      <w:pPr>
+        <w:pStyle w:val="FirstParagraph"/>
+      </w:pPr>
+      <w:r>
+        <w:rPr>
+          <w:i/>
+          <w:iCs/>
+        </w:rPr>
+        <w:t xml:space="preserve">Besvarer §21: teknisk løsning, datamodell, integrasjonsløsning,</w:t>
+      </w:r>
+      <w:r>
+        <w:rPr>
+          <w:i/>
+          <w:iCs/>
+        </w:rPr>
+        <w:t xml:space="preserve"> </w:t>
+      </w:r>
+      <w:r>
+        <w:rPr>
+          <w:i/>
+          <w:iCs/>
+        </w:rPr>
+        <w:t xml:space="preserve">brukergrensesnitt.</w:t>
+      </w:r>
+    </w:p>
+    <w:bookmarkStart w:id="20" w:name="arkitektur"/>
+    <w:p>
+      <w:pPr>
+        <w:pStyle w:val="Heading2"/>
+      </w:pPr>
+      <w:r>
+        <w:t xml:space="preserve">3.1 Arkitektur</w:t>
+      </w:r>
+    </w:p>
+    <w:tbl>
+      <w:tblPr>
+        <w:tblStyle w:val="Table"/>
+        <w:tblW w:type="pct" w:w="5000"/>
+        <w:tblLayout w:type="fixed"/>
+        <w:tblLook w:firstRow="1" w:lastRow="0" w:firstColumn="0" w:lastColumn="0" w:noHBand="0" w:noVBand="0" w:val="0020"/>
+      </w:tblPr>
+      <w:tblGrid>
+        <w:gridCol w:w="2640"/>
+        <w:gridCol w:w="2640"/>
+        <w:gridCol w:w="2640"/>
+      </w:tblGrid>
+      <w:tr>
+        <w:trPr>
+          <w:tblHeader w:val="on"/>
+        </w:trPr>
+        <w:tc>
+          <w:tcPr/>
+          <w:p>
+            <w:pPr>
+              <w:pStyle w:val="Compact"/>
+            </w:pPr>
+            <w:r>
               <w:t xml:space="preserve">Lag</w:t>
             </w:r>
           </w:p>
@@ -1782,8 +2019,8 @@
         <w:t xml:space="preserve">plattform, og en del av vår risikohåndtering. Se kapittel 9 og 11.</w:t>
       </w:r>
     </w:p>
-    <w:bookmarkEnd w:id="19"/>
-    <w:bookmarkStart w:id="21" w:name="datamodell"/>
+    <w:bookmarkEnd w:id="20"/>
+    <w:bookmarkStart w:id="22" w:name="datamodell"/>
     <w:p>
       <w:pPr>
         <w:pStyle w:val="Heading2"/>
@@ -2196,7 +2433,7 @@
         <w:t xml:space="preserve">gateløp (§8). Disse er beskrevet i henholdsvis kapittel 3.5, 5 og 8.</w:t>
       </w:r>
     </w:p>
-    <w:bookmarkStart w:id="20" w:name="kildetrofasthet-som-prinsipp"/>
+    <w:bookmarkStart w:id="21" w:name="kildetrofasthet-som-prinsipp"/>
     <w:p>
       <w:pPr>
         <w:pStyle w:val="Heading3"/>
@@ -2302,9 +2539,9 @@
         <w:t xml:space="preserve">resultatene i §7, der kravspekken selv sier at kodeverket er «TBD».</w:t>
       </w:r>
     </w:p>
-    <w:bookmarkEnd w:id="20"/>
     <w:bookmarkEnd w:id="21"/>
-    <w:bookmarkStart w:id="23" w:name="brukergrensesnitt"/>
+    <w:bookmarkEnd w:id="22"/>
+    <w:bookmarkStart w:id="24" w:name="brukergrensesnitt"/>
     <w:p>
       <w:pPr>
         <w:pStyle w:val="Heading2"/>
@@ -2487,7 +2724,7 @@
         <w:t xml:space="preserve">kan bestille det som viser seg å være nyttig i bruk.</w:t>
       </w:r>
     </w:p>
-    <w:bookmarkStart w:id="22" w:name="X6b78591d3822ef2a39c33aa148d914c4852f9bb"/>
+    <w:bookmarkStart w:id="23" w:name="X6b78591d3822ef2a39c33aa148d914c4852f9bb"/>
     <w:p>
       <w:pPr>
         <w:pStyle w:val="Heading3"/>
@@ -2840,9 +3077,9 @@
         <w:t xml:space="preserve">uttaksarbeid, og visninger bestilt av trenere, statistikkmiljøet eller media.</w:t>
       </w:r>
     </w:p>
-    <w:bookmarkEnd w:id="22"/>
     <w:bookmarkEnd w:id="23"/>
-    <w:bookmarkStart w:id="24" w:name="api-og-eksport"/>
+    <w:bookmarkEnd w:id="24"/>
+    <w:bookmarkStart w:id="25" w:name="api-og-eksport"/>
     <w:p>
       <w:pPr>
         <w:pStyle w:val="Heading2"/>
@@ -2945,8 +3182,8 @@
         <w:t xml:space="preserve">forbundets egne tall.</w:t>
       </w:r>
     </w:p>
-    <w:bookmarkEnd w:id="24"/>
-    <w:bookmarkStart w:id="29" w:name="kvalitetsnivåer-og-flagging"/>
+    <w:bookmarkEnd w:id="25"/>
+    <w:bookmarkStart w:id="30" w:name="kvalitetsnivåer-og-flagging"/>
     <w:p>
       <w:pPr>
         <w:pStyle w:val="Heading2"/>
@@ -2967,7 +3204,7 @@
         <w:t xml:space="preserve">§6, §7, §16.</w:t>
       </w:r>
     </w:p>
-    <w:bookmarkStart w:id="25" w:name="kvalitetsnivå-abc"/>
+    <w:bookmarkStart w:id="26" w:name="kvalitetsnivå-abc"/>
     <w:p>
       <w:pPr>
         <w:pStyle w:val="Heading3"/>
@@ -2990,8 +3227,8 @@
         <w:t xml:space="preserve">og sporing av hvem som har satt eller overstyrt det.</w:t>
       </w:r>
     </w:p>
-    <w:bookmarkEnd w:id="25"/>
-    <w:bookmarkStart w:id="26" w:name="Xd9830d3293bc9d337fdae031d369fef3105b8dc"/>
+    <w:bookmarkEnd w:id="26"/>
+    <w:bookmarkStart w:id="27" w:name="Xd9830d3293bc9d337fdae031d369fef3105b8dc"/>
     <w:p>
       <w:pPr>
         <w:pStyle w:val="Heading3"/>
@@ -3264,8 +3501,8 @@
         <w:t xml:space="preserve">resultater i året.</w:t>
       </w:r>
     </w:p>
-    <w:bookmarkEnd w:id="26"/>
-    <w:bookmarkStart w:id="27" w:name="unntakene-er-arbeidet"/>
+    <w:bookmarkEnd w:id="27"/>
+    <w:bookmarkStart w:id="28" w:name="unntakene-er-arbeidet"/>
     <w:p>
       <w:pPr>
         <w:pStyle w:val="Heading3"/>
@@ -3496,8 +3733,8 @@
         <w:t xml:space="preserve">Brukere kan filtrere statistikken på nivå, jf. §6.</w:t>
       </w:r>
     </w:p>
-    <w:bookmarkEnd w:id="27"/>
-    <w:bookmarkStart w:id="28" w:name="flagging"/>
+    <w:bookmarkEnd w:id="28"/>
+    <w:bookmarkStart w:id="29" w:name="flagging"/>
     <w:p>
       <w:pPr>
         <w:pStyle w:val="Heading3"/>
@@ -3737,9 +3974,9 @@
         </w:tc>
       </w:tr>
     </w:tbl>
-    <w:bookmarkEnd w:id="28"/>
     <w:bookmarkEnd w:id="29"/>
-    <w:bookmarkStart w:id="33" w:name="integrasjoner-og-dataimport"/>
+    <w:bookmarkEnd w:id="30"/>
+    <w:bookmarkStart w:id="34" w:name="integrasjoner-og-dataimport"/>
     <w:p>
       <w:pPr>
         <w:pStyle w:val="Heading2"/>
@@ -3760,7 +3997,7 @@
         <w:t xml:space="preserve">§13, §14.</w:t>
       </w:r>
     </w:p>
-    <w:bookmarkStart w:id="30" w:name="innsamling-som-driftsfunksjon"/>
+    <w:bookmarkStart w:id="31" w:name="innsamling-som-driftsfunksjon"/>
     <w:p>
       <w:pPr>
         <w:pStyle w:val="Heading3"/>
@@ -3815,8 +4052,8 @@
         <w:t xml:space="preserve">ikke som opsjon.</w:t>
       </w:r>
     </w:p>
-    <w:bookmarkEnd w:id="30"/>
-    <w:bookmarkStart w:id="31" w:name="importrammeverket"/>
+    <w:bookmarkEnd w:id="31"/>
+    <w:bookmarkStart w:id="32" w:name="importrammeverket"/>
     <w:p>
       <w:pPr>
         <w:pStyle w:val="Heading3"/>
@@ -3919,8 +4156,8 @@
         <w:t xml:space="preserve">bare tallene, men også vissheten om hvor de kommer fra.</w:t>
       </w:r>
     </w:p>
-    <w:bookmarkEnd w:id="31"/>
-    <w:bookmarkStart w:id="32" w:name="norske-resultater-i-utlandet"/>
+    <w:bookmarkEnd w:id="32"/>
+    <w:bookmarkStart w:id="33" w:name="norske-resultater-i-utlandet"/>
     <w:p>
       <w:pPr>
         <w:pStyle w:val="Heading3"/>
@@ -4146,36 +4383,62 @@
           <w:b/>
           <w:bCs/>
         </w:rPr>
-        <w:t xml:space="preserve">Om §14, fremtidig iSonen-arbeidsflyt:</w:t>
-      </w:r>
-      <w:r>
-        <w:t xml:space="preserve"> </w:t>
-      </w:r>
-      <w:r>
-        <w:t xml:space="preserve">Kravspekken beskriver en arbeidsflyt</w:t>
-      </w:r>
-      <w:r>
-        <w:t xml:space="preserve"> </w:t>
-      </w:r>
-      <w:r>
-        <w:t xml:space="preserve">som ennå ikke finnes. Vi lover forberedt arkitektur og deltakelse i</w:t>
-      </w:r>
-      <w:r>
-        <w:t xml:space="preserve"> </w:t>
-      </w:r>
-      <w:r>
-        <w:t xml:space="preserve">spesifikasjonsarbeidet, ikke en ferdig integrasjon mot noe som ikke er</w:t>
-      </w:r>
-      <w:r>
-        <w:t xml:space="preserve"> </w:t>
-      </w:r>
-      <w:r>
-        <w:t xml:space="preserve">definert.</w:t>
-      </w:r>
-    </w:p>
-    <w:bookmarkEnd w:id="32"/>
+        <w:t xml:space="preserve">Om §14, iSonen-arbeidsflyten:</w:t>
+      </w:r>
+      <w:r>
+        <w:t xml:space="preserve"> </w:t>
+      </w:r>
+      <w:r>
+        <w:t xml:space="preserve">Vi merker oss at NFIF allerede arbeider med</w:t>
+      </w:r>
+      <w:r>
+        <w:t xml:space="preserve"> </w:t>
+      </w:r>
+      <w:r>
+        <w:t xml:space="preserve">Buypass om integrasjoner mellom iSonen og konkurransesystemene OpenTrack og</w:t>
+      </w:r>
+      <w:r>
+        <w:t xml:space="preserve"> </w:t>
+      </w:r>
+      <w:r>
+        <w:t xml:space="preserve">FriRes, og mot EQ Timing for løp utenfor bane. Det er en fordel for oss:</w:t>
+      </w:r>
+      <w:r>
+        <w:t xml:space="preserve"> </w:t>
+      </w:r>
+      <w:r>
+        <w:t xml:space="preserve">plattformen skal ta imot enden av den dataflyten, ikke definere den.</w:t>
+      </w:r>
+    </w:p>
+    <w:p>
+      <w:pPr>
+        <w:pStyle w:val="BodyText"/>
+      </w:pPr>
+      <w:r>
+        <w:t xml:space="preserve">Vi ber derfor om å bli koblet på det arbeidet tidlig, og å få</w:t>
+      </w:r>
+      <w:r>
+        <w:t xml:space="preserve"> </w:t>
+      </w:r>
+      <w:r>
+        <w:t xml:space="preserve">grensesnittspesifikasjonene etter hvert som de foreligger. Vi lover forberedt</w:t>
+      </w:r>
+      <w:r>
+        <w:t xml:space="preserve"> </w:t>
+      </w:r>
+      <w:r>
+        <w:t xml:space="preserve">arkitektur og deltakelse i spesifikasjonsarbeidet. Ferdig integrasjon kan</w:t>
+      </w:r>
+      <w:r>
+        <w:t xml:space="preserve"> </w:t>
+      </w:r>
+      <w:r>
+        <w:t xml:space="preserve">først fastprises når grensesnittene er dokumentert.</w:t>
+      </w:r>
+    </w:p>
     <w:bookmarkEnd w:id="33"/>
-    <w:bookmarkStart w:id="34" w:name="datakvalitet-hvor-vi-står-i-dag"/>
+    <w:bookmarkEnd w:id="34"/>
+    <w:bookmarkStart w:id="35" w:name="datakvalitet-hvor-vi-står-i-dag"/>
     <w:p>
       <w:pPr>
         <w:pStyle w:val="Heading2"/>
@@ -4526,9 +4789,9 @@
         </w:pict>
       </w:r>
     </w:p>
-    <w:bookmarkEnd w:id="34"/>
     <w:bookmarkEnd w:id="35"/>
-    <w:bookmarkStart w:id="44" w:name="Xb559445a4808077181942a8c638197d50ecfdb6"/>
+    <w:bookmarkEnd w:id="36"/>
+    <w:bookmarkStart w:id="45" w:name="Xb559445a4808077181942a8c638197d50ecfdb6"/>
     <w:p>
       <w:pPr>
         <w:pStyle w:val="Heading1"/>
@@ -4571,7 +4834,7 @@
         <w:t xml:space="preserve">Dette er en praksis vi kan dokumentere, ikke en idé vi lanserer.</w:t>
       </w:r>
     </w:p>
-    <w:bookmarkStart w:id="36" w:name="mesterskapsanalyse"/>
+    <w:bookmarkStart w:id="37" w:name="mesterskapsanalyse"/>
     <w:p>
       <w:pPr>
         <w:pStyle w:val="Heading2"/>
@@ -4620,8 +4883,8 @@
         <w:t xml:space="preserve">mesterskap, og som ingen rekker å lage manuelt. Vedlagt som vedlegg C.</w:t>
       </w:r>
     </w:p>
-    <w:bookmarkEnd w:id="36"/>
-    <w:bookmarkStart w:id="37" w:name="bredde--og-rekrutteringsanalyse"/>
+    <w:bookmarkEnd w:id="37"/>
+    <w:bookmarkStart w:id="38" w:name="bredde--og-rekrutteringsanalyse"/>
     <w:p>
       <w:pPr>
         <w:pStyle w:val="Heading2"/>
@@ -4676,8 +4939,8 @@
         <w:t xml:space="preserve">allerede gjort den analysen.</w:t>
       </w:r>
     </w:p>
-    <w:bookmarkEnd w:id="37"/>
-    <w:bookmarkStart w:id="41" w:name="forskning-på-nfifs-eget-datagrunnlag"/>
+    <w:bookmarkEnd w:id="38"/>
+    <w:bookmarkStart w:id="42" w:name="forskning-på-nfifs-eget-datagrunnlag"/>
     <w:p>
       <w:pPr>
         <w:pStyle w:val="Heading2"/>
@@ -4694,7 +4957,7 @@
         <w:t xml:space="preserve">Denne kapasiteten er fagfellevurdert og publisert, på forbundets egne data.</w:t>
       </w:r>
     </w:p>
-    <w:bookmarkStart w:id="38" w:name="arbeider-basert-på-data-fra-nfif"/>
+    <w:bookmarkStart w:id="39" w:name="arbeider-basert-på-data-fra-nfif"/>
     <w:p>
       <w:pPr>
         <w:pStyle w:val="Heading3"/>
@@ -4841,8 +5104,8 @@
         <w:t xml:space="preserve">10 (6), e0129014.</w:t>
       </w:r>
     </w:p>
-    <w:bookmarkEnd w:id="38"/>
-    <w:bookmarkStart w:id="39" w:name="arbeid-på-tilsvarende-datagrunnlag"/>
+    <w:bookmarkEnd w:id="39"/>
+    <w:bookmarkStart w:id="40" w:name="arbeid-på-tilsvarende-datagrunnlag"/>
     <w:p>
       <w:pPr>
         <w:pStyle w:val="Heading3"/>
@@ -4910,8 +5173,8 @@
         <w:t xml:space="preserve">, antatt for publisering.</w:t>
       </w:r>
     </w:p>
-    <w:bookmarkEnd w:id="39"/>
-    <w:bookmarkStart w:id="40" w:name="hva-dette-betyr-for-anskaffelsen"/>
+    <w:bookmarkEnd w:id="40"/>
+    <w:bookmarkStart w:id="41" w:name="hva-dette-betyr-for-anskaffelsen"/>
     <w:p>
       <w:pPr>
         <w:pStyle w:val="Heading3"/>
@@ -5054,9 +5317,9 @@
         <w:t xml:space="preserve">allerede har publisert på deres data.</w:t>
       </w:r>
     </w:p>
-    <w:bookmarkEnd w:id="40"/>
     <w:bookmarkEnd w:id="41"/>
-    <w:bookmarkStart w:id="42" w:name="tjenestekatalog"/>
+    <w:bookmarkEnd w:id="42"/>
+    <w:bookmarkStart w:id="43" w:name="tjenestekatalog"/>
     <w:p>
       <w:pPr>
         <w:pStyle w:val="Heading2"/>
@@ -5340,8 +5603,8 @@
         <w:t xml:space="preserve">kapittel 12.</w:t>
       </w:r>
     </w:p>
-    <w:bookmarkEnd w:id="42"/>
-    <w:bookmarkStart w:id="43" w:name="et-forbehold-vi-tar-opp-selv"/>
+    <w:bookmarkEnd w:id="43"/>
+    <w:bookmarkStart w:id="44" w:name="et-forbehold-vi-tar-opp-selv"/>
     <w:p>
       <w:pPr>
         <w:pStyle w:val="Heading2"/>
@@ -5429,9 +5692,9 @@
         </w:pict>
       </w:r>
     </w:p>
-    <w:bookmarkEnd w:id="43"/>
     <w:bookmarkEnd w:id="44"/>
-    <w:bookmarkStart w:id="48" w:name="gateløp-veikart"/>
+    <w:bookmarkEnd w:id="45"/>
+    <w:bookmarkStart w:id="49" w:name="gateløp-veikart"/>
     <w:p>
       <w:pPr>
         <w:pStyle w:val="Heading1"/>
@@ -5486,7 +5749,7 @@
         <w:t xml:space="preserve">av tilbudet.</w:t>
       </w:r>
     </w:p>
-    <w:bookmarkStart w:id="45" w:name="omfang"/>
+    <w:bookmarkStart w:id="46" w:name="omfang"/>
     <w:p>
       <w:pPr>
         <w:pStyle w:val="Heading2"/>
@@ -5565,8 +5828,8 @@
         <w:t xml:space="preserve">hører hjemme i basen etter §8.</w:t>
       </w:r>
     </w:p>
-    <w:bookmarkEnd w:id="45"/>
-    <w:bookmarkStart w:id="46" w:name="X86467ed951c6b36b4ea3134ceb482096d645801"/>
+    <w:bookmarkEnd w:id="46"/>
+    <w:bookmarkStart w:id="47" w:name="X86467ed951c6b36b4ea3134ceb482096d645801"/>
     <w:p>
       <w:pPr>
         <w:pStyle w:val="Heading2"/>
@@ -5680,8 +5943,8 @@
         <w:t xml:space="preserve">etter.</w:t>
       </w:r>
     </w:p>
-    <w:bookmarkEnd w:id="46"/>
-    <w:bookmarkStart w:id="47" w:name="leveranseplan"/>
+    <w:bookmarkEnd w:id="47"/>
+    <w:bookmarkStart w:id="48" w:name="leveranseplan"/>
     <w:p>
       <w:pPr>
         <w:pStyle w:val="Heading2"/>
@@ -5949,9 +6212,9 @@
         </w:pict>
       </w:r>
     </w:p>
-    <w:bookmarkEnd w:id="47"/>
     <w:bookmarkEnd w:id="48"/>
-    <w:bookmarkStart w:id="52" w:name="historiske-data"/>
+    <w:bookmarkEnd w:id="49"/>
+    <w:bookmarkStart w:id="53" w:name="historiske-data"/>
     <w:p>
       <w:pPr>
         <w:pStyle w:val="Heading1"/>
@@ -5972,7 +6235,7 @@
         <w:t xml:space="preserve">§15.</w:t>
       </w:r>
     </w:p>
-    <w:bookmarkStart w:id="49" w:name="førsteprioriteten-er-levert"/>
+    <w:bookmarkStart w:id="50" w:name="førsteprioriteten-er-levert"/>
     <w:p>
       <w:pPr>
         <w:pStyle w:val="Heading2"/>
@@ -6042,8 +6305,8 @@
         <w:t xml:space="preserve">som gjør at vi kan oppgi dybden over som et faktum og ikke som et estimat.</w:t>
       </w:r>
     </w:p>
-    <w:bookmarkEnd w:id="49"/>
-    <w:bookmarkStart w:id="50" w:name="alle-tiders-materialet-er-allerede-inne"/>
+    <w:bookmarkEnd w:id="50"/>
+    <w:bookmarkStart w:id="51" w:name="alle-tiders-materialet-er-allerede-inne"/>
     <w:p>
       <w:pPr>
         <w:pStyle w:val="Heading2"/>
@@ -6251,8 +6514,8 @@
         <w:t xml:space="preserve">dagens statistikkplattform ble laget.</w:t>
       </w:r>
     </w:p>
-    <w:bookmarkEnd w:id="50"/>
-    <w:bookmarkStart w:id="51" w:name="videre-historisk-utvidelse"/>
+    <w:bookmarkEnd w:id="51"/>
+    <w:bookmarkStart w:id="52" w:name="videre-historisk-utvidelse"/>
     <w:p>
       <w:pPr>
         <w:pStyle w:val="Heading2"/>
@@ -6334,9 +6597,9 @@
         </w:pict>
       </w:r>
     </w:p>
-    <w:bookmarkEnd w:id="51"/>
     <w:bookmarkEnd w:id="52"/>
-    <w:bookmarkStart w:id="56" w:name="X46c0cf94db48a3ee3554fb2ab3c1504124a6902"/>
+    <w:bookmarkEnd w:id="53"/>
+    <w:bookmarkStart w:id="57" w:name="X46c0cf94db48a3ee3554fb2ab3c1504124a6902"/>
     <w:p>
       <w:pPr>
         <w:pStyle w:val="Heading1"/>
@@ -6357,7 +6620,7 @@
         <w:t xml:space="preserve">§19, §17.</w:t>
       </w:r>
     </w:p>
-    <w:bookmarkStart w:id="53" w:name="personvern-for-mindreårige"/>
+    <w:bookmarkStart w:id="54" w:name="personvern-for-mindreårige"/>
     <w:p>
       <w:pPr>
         <w:pStyle w:val="Heading2"/>
@@ -6608,8 +6871,8 @@
         <w:t xml:space="preserve">sitter spredt i koden. Endrer NFIF regelverket, endres grensen ett sted.</w:t>
       </w:r>
     </w:p>
-    <w:bookmarkEnd w:id="53"/>
-    <w:bookmarkStart w:id="54" w:name="sikkerhet"/>
+    <w:bookmarkEnd w:id="54"/>
+    <w:bookmarkStart w:id="55" w:name="sikkerhet"/>
     <w:p>
       <w:pPr>
         <w:pStyle w:val="Heading2"/>
@@ -6644,8 +6907,8 @@
         <w:t xml:space="preserve">med dokumentert gjenopprettingsrutine.</w:t>
       </w:r>
     </w:p>
-    <w:bookmarkEnd w:id="54"/>
-    <w:bookmarkStart w:id="55" w:name="beredskap-ved-topplast"/>
+    <w:bookmarkEnd w:id="55"/>
+    <w:bookmarkStart w:id="56" w:name="beredskap-ved-topplast"/>
     <w:p>
       <w:pPr>
         <w:pStyle w:val="Heading2"/>
@@ -6681,9 +6944,9 @@
         </w:pict>
       </w:r>
     </w:p>
-    <w:bookmarkEnd w:id="55"/>
     <w:bookmarkEnd w:id="56"/>
-    <w:bookmarkStart w:id="60" w:name="leveranseplan-1"/>
+    <w:bookmarkEnd w:id="57"/>
+    <w:bookmarkStart w:id="61" w:name="leveranseplan-1"/>
     <w:p>
       <w:pPr>
         <w:pStyle w:val="Heading1"/>
@@ -6704,7 +6967,7 @@
         <w:t xml:space="preserve">§21 tidsplan, §20 faser, §24 frister.</w:t>
       </w:r>
     </w:p>
-    <w:bookmarkStart w:id="57" w:name="frem-til-01.01.2027"/>
+    <w:bookmarkStart w:id="58" w:name="frem-til-01.01.2027"/>
     <w:p>
       <w:pPr>
         <w:pStyle w:val="Heading2"/>
@@ -6718,13 +6981,39 @@
         <w:pStyle w:val="FirstParagraph"/>
       </w:pPr>
       <w:r>
-        <w:t xml:space="preserve">§24 krever en operativ løsning som dekker minst alle baneresultater innen</w:t>
-      </w:r>
-      <w:r>
-        <w:t xml:space="preserve"> </w:t>
-      </w:r>
-      <w:r>
-        <w:t xml:space="preserve">01.01.2027. Under er det som gjenstår for å oppfylle det.</w:t>
+        <w:t xml:space="preserve">Målsettingen er en operativ løsning for både bane og løp utenfor bane fra</w:t>
+      </w:r>
+      <w:r>
+        <w:t xml:space="preserve"> </w:t>
+      </w:r>
+      <w:r>
+        <w:t xml:space="preserve">01.01.2027. Dekker første leveranse ikke løp utenfor bane, skal leverandøren</w:t>
+      </w:r>
+      <w:r>
+        <w:t xml:space="preserve"> </w:t>
+      </w:r>
+      <w:r>
+        <w:t xml:space="preserve">beskrive en realistisk plan for neste fase.</w:t>
+      </w:r>
+    </w:p>
+    <w:p>
+      <w:pPr>
+        <w:pStyle w:val="BodyText"/>
+      </w:pPr>
+      <w:r>
+        <w:t xml:space="preserve">Vi er ærlige på at vi treffer den første halvdelen og ikke den andre: bane er i</w:t>
+      </w:r>
+      <w:r>
+        <w:t xml:space="preserve"> </w:t>
+      </w:r>
+      <w:r>
+        <w:t xml:space="preserve">drift, løp utenfor bane må bygges. Planen for det står i kapittel 5. Under er</w:t>
+      </w:r>
+      <w:r>
+        <w:t xml:space="preserve"> </w:t>
+      </w:r>
+      <w:r>
+        <w:t xml:space="preserve">det som gjenstår på banesiden.</w:t>
       </w:r>
     </w:p>
     <w:tbl>
@@ -7473,8 +7762,8 @@
         </w:tc>
       </w:tr>
     </w:tbl>
-    <w:bookmarkEnd w:id="57"/>
-    <w:bookmarkStart w:id="58" w:name="og-senere"/>
+    <w:bookmarkEnd w:id="58"/>
+    <w:bookmarkStart w:id="59" w:name="og-senere"/>
     <w:p>
       <w:pPr>
         <w:pStyle w:val="Heading2"/>
@@ -7694,8 +7983,8 @@
         <w:t xml:space="preserve">bunnen, og det er en reell kostnadsfordel.</w:t>
       </w:r>
     </w:p>
-    <w:bookmarkEnd w:id="58"/>
-    <w:bookmarkStart w:id="59" w:name="overgang-og-parallelldrift"/>
+    <w:bookmarkEnd w:id="59"/>
+    <w:bookmarkStart w:id="60" w:name="overgang-og-parallelldrift"/>
     <w:p>
       <w:pPr>
         <w:pStyle w:val="Heading2"/>
@@ -7737,9 +8026,9 @@
         </w:pict>
       </w:r>
     </w:p>
-    <w:bookmarkEnd w:id="59"/>
     <w:bookmarkEnd w:id="60"/>
-    <w:bookmarkStart w:id="71" w:name="organisasjon-bemanning-og-risiko"/>
+    <w:bookmarkEnd w:id="61"/>
+    <w:bookmarkStart w:id="72" w:name="organisasjon-bemanning-og-risiko"/>
     <w:p>
       <w:pPr>
         <w:pStyle w:val="Heading1"/>
@@ -7748,7 +8037,7 @@
         <w:t xml:space="preserve">9. Organisasjon, bemanning og risiko</w:t>
       </w:r>
     </w:p>
-    <w:bookmarkStart w:id="61" w:name="om-athlete-mindset-as"/>
+    <w:bookmarkStart w:id="62" w:name="om-athlete-mindset-as"/>
     <w:p>
       <w:pPr>
         <w:pStyle w:val="Heading2"/>
@@ -7835,8 +8124,8 @@
         <w:t xml:space="preserve">kjerneprodukt, ikke som et enkeltoppdrag ved siden av.</w:t>
       </w:r>
     </w:p>
-    <w:bookmarkEnd w:id="61"/>
-    <w:bookmarkStart w:id="67" w:name="teamet"/>
+    <w:bookmarkEnd w:id="62"/>
+    <w:bookmarkStart w:id="68" w:name="teamet"/>
     <w:p>
       <w:pPr>
         <w:pStyle w:val="Heading2"/>
@@ -7871,7 +8160,7 @@
         <w:t xml:space="preserve">den det.</w:t>
       </w:r>
     </w:p>
-    <w:bookmarkStart w:id="62" w:name="X1358178f2f3113eb3f93b9fb90a82b510efbbf2"/>
+    <w:bookmarkStart w:id="63" w:name="X1358178f2f3113eb3f93b9fb90a82b510efbbf2"/>
     <w:p>
       <w:pPr>
         <w:pStyle w:val="Heading3"/>
@@ -7964,8 +8253,8 @@
         <w:t xml:space="preserve">som krever en som har sittet i jury.</w:t>
       </w:r>
     </w:p>
-    <w:bookmarkEnd w:id="62"/>
-    <w:bookmarkStart w:id="63" w:name="Xba80a0082db25501faf7604926b51b1fb71f77e"/>
+    <w:bookmarkEnd w:id="63"/>
+    <w:bookmarkStart w:id="64" w:name="Xba80a0082db25501faf7604926b51b1fb71f77e"/>
     <w:p>
       <w:pPr>
         <w:pStyle w:val="Heading3"/>
@@ -8028,8 +8317,8 @@
         <w:t xml:space="preserve">kvalifiseringskrav beskrevet i kapittel 2.</w:t>
       </w:r>
     </w:p>
-    <w:bookmarkEnd w:id="63"/>
-    <w:bookmarkStart w:id="64" w:name="X05261a76fafde30046c12f1cad824d36222d9af"/>
+    <w:bookmarkEnd w:id="64"/>
+    <w:bookmarkStart w:id="65" w:name="X05261a76fafde30046c12f1cad824d36222d9af"/>
     <w:p>
       <w:pPr>
         <w:pStyle w:val="Heading3"/>
@@ -8092,8 +8381,8 @@
         <w:t xml:space="preserve">leser tall, blir en plattform for statistikere.</w:t>
       </w:r>
     </w:p>
-    <w:bookmarkEnd w:id="64"/>
-    <w:bookmarkStart w:id="65" w:name="Xa3bcf547d72336551e333f1df97d72f76f7f8f6"/>
+    <w:bookmarkEnd w:id="65"/>
+    <w:bookmarkStart w:id="66" w:name="Xa3bcf547d72336551e333f1df97d72f76f7f8f6"/>
     <w:p>
       <w:pPr>
         <w:pStyle w:val="Heading3"/>
@@ -8174,8 +8463,8 @@
         <w:t xml:space="preserve">er miljøet vi kommer fra.</w:t>
       </w:r>
     </w:p>
-    <w:bookmarkEnd w:id="65"/>
-    <w:bookmarkStart w:id="66" w:name="hva-teamet-betyr-for-nfif"/>
+    <w:bookmarkEnd w:id="66"/>
+    <w:bookmarkStart w:id="67" w:name="hva-teamet-betyr-for-nfif"/>
     <w:p>
       <w:pPr>
         <w:pStyle w:val="Heading3"/>
@@ -8391,9 +8680,9 @@
         </w:tc>
       </w:tr>
     </w:tbl>
-    <w:bookmarkEnd w:id="66"/>
     <w:bookmarkEnd w:id="67"/>
-    <w:bookmarkStart w:id="68" w:name="innvendingen-vi-tar-opp-selv"/>
+    <w:bookmarkEnd w:id="68"/>
+    <w:bookmarkStart w:id="69" w:name="innvendingen-vi-tar-opp-selv"/>
     <w:p>
       <w:pPr>
         <w:pStyle w:val="Heading2"/>
@@ -8631,8 +8920,8 @@
         <w:t xml:space="preserve">lavere enn et konsulenthus, og hvorfor vi blir værende.</w:t>
       </w:r>
     </w:p>
-    <w:bookmarkEnd w:id="68"/>
-    <w:bookmarkStart w:id="69" w:name="om-det-frivillige-miljøet"/>
+    <w:bookmarkEnd w:id="69"/>
+    <w:bookmarkStart w:id="70" w:name="om-det-frivillige-miljøet"/>
     <w:p>
       <w:pPr>
         <w:pStyle w:val="Heading2"/>
@@ -8693,8 +8982,8 @@
         <w:t xml:space="preserve">tillit i statistikkmiljøet blir en plattform ingen bruker.</w:t>
       </w:r>
     </w:p>
-    <w:bookmarkEnd w:id="69"/>
-    <w:bookmarkStart w:id="70" w:name="risiko"/>
+    <w:bookmarkEnd w:id="70"/>
+    <w:bookmarkStart w:id="71" w:name="risiko"/>
     <w:p>
       <w:pPr>
         <w:pStyle w:val="Heading2"/>
@@ -8965,9 +9254,9 @@
         </w:pict>
       </w:r>
     </w:p>
-    <w:bookmarkEnd w:id="70"/>
     <w:bookmarkEnd w:id="71"/>
-    <w:bookmarkStart w:id="72" w:name="support-og-vedlikehold"/>
+    <w:bookmarkEnd w:id="72"/>
+    <w:bookmarkStart w:id="73" w:name="support-og-vedlikehold"/>
     <w:p>
       <w:pPr>
         <w:pStyle w:val="Heading1"/>
@@ -9246,8 +9535,8 @@
         </w:pict>
       </w:r>
     </w:p>
-    <w:bookmarkEnd w:id="72"/>
-    <w:bookmarkStart w:id="73" w:name="dataeierskap-exit-og-escrow"/>
+    <w:bookmarkEnd w:id="73"/>
+    <w:bookmarkStart w:id="74" w:name="dataeierskap-exit-og-escrow"/>
     <w:p>
       <w:pPr>
         <w:pStyle w:val="Heading1"/>
@@ -9421,8 +9710,8 @@
         </w:pict>
       </w:r>
     </w:p>
-    <w:bookmarkEnd w:id="73"/>
-    <w:bookmarkStart w:id="79" w:name="pris"/>
+    <w:bookmarkEnd w:id="74"/>
+    <w:bookmarkStart w:id="80" w:name="pris"/>
     <w:p>
       <w:pPr>
         <w:pStyle w:val="Heading1"/>
@@ -9523,7 +9812,7 @@
         <w:t xml:space="preserve">vi ber om å sette sammen med NFIF.</w:t>
       </w:r>
     </w:p>
-    <w:bookmarkStart w:id="74" w:name="prinsipper"/>
+    <w:bookmarkStart w:id="75" w:name="prinsipper"/>
     <w:p>
       <w:pPr>
         <w:pStyle w:val="Heading2"/>
@@ -9699,8 +9988,8 @@
         <w:t xml:space="preserve">arrangerer flere stevner.</w:t>
       </w:r>
     </w:p>
-    <w:bookmarkEnd w:id="74"/>
-    <w:bookmarkStart w:id="75" w:name="etablering-og-implementering-fastpris"/>
+    <w:bookmarkEnd w:id="75"/>
+    <w:bookmarkStart w:id="76" w:name="etablering-og-implementering-fastpris"/>
     <w:p>
       <w:pPr>
         <w:pStyle w:val="Heading2"/>
@@ -9844,8 +10133,8 @@
         </w:tc>
       </w:tr>
     </w:tbl>
-    <w:bookmarkEnd w:id="75"/>
-    <w:bookmarkStart w:id="76" w:name="årlig-drift-fastpris"/>
+    <w:bookmarkEnd w:id="76"/>
+    <w:bookmarkStart w:id="77" w:name="årlig-drift-fastpris"/>
     <w:p>
       <w:pPr>
         <w:pStyle w:val="Heading2"/>
@@ -10013,8 +10302,8 @@
         </w:tc>
       </w:tr>
     </w:tbl>
-    <w:bookmarkEnd w:id="76"/>
-    <w:bookmarkStart w:id="77" w:name="opsjoner-timepott-med-estimert-spenn"/>
+    <w:bookmarkEnd w:id="77"/>
+    <w:bookmarkStart w:id="78" w:name="opsjoner-timepott-med-estimert-spenn"/>
     <w:p>
       <w:pPr>
         <w:pStyle w:val="Heading2"/>
@@ -10206,8 +10495,8 @@
         </w:tc>
       </w:tr>
     </w:tbl>
-    <w:bookmarkEnd w:id="77"/>
-    <w:bookmarkStart w:id="78" w:name="grunnlag-for-forhandling"/>
+    <w:bookmarkEnd w:id="78"/>
+    <w:bookmarkStart w:id="79" w:name="grunnlag-for-forhandling"/>
     <w:p>
       <w:pPr>
         <w:pStyle w:val="Heading2"/>
@@ -10263,9 +10552,9 @@
         </w:pict>
       </w:r>
     </w:p>
-    <w:bookmarkEnd w:id="78"/>
     <w:bookmarkEnd w:id="79"/>
-    <w:bookmarkStart w:id="80" w:name="forbehold-og-forutsetninger"/>
+    <w:bookmarkEnd w:id="80"/>
+    <w:bookmarkStart w:id="81" w:name="forbehold-og-forutsetninger"/>
     <w:p>
       <w:pPr>
         <w:pStyle w:val="Heading1"/>
@@ -10315,22 +10604,31 @@
           <w:b/>
           <w:bCs/>
         </w:rPr>
-        <w:t xml:space="preserve">§14, fremtidig iSonen-arbeidsflyt</w:t>
-      </w:r>
-      <w:r>
-        <w:t xml:space="preserve">, beskriver en arbeidsflyt som ennå ikke</w:t>
-      </w:r>
-      <w:r>
-        <w:t xml:space="preserve"> </w:t>
-      </w:r>
-      <w:r>
-        <w:t xml:space="preserve">er definert. Vi lover forberedt arkitektur og deltakelse i</w:t>
-      </w:r>
-      <w:r>
-        <w:t xml:space="preserve"> </w:t>
-      </w:r>
-      <w:r>
-        <w:t xml:space="preserve">spesifikasjonsarbeidet, ikke ferdig integrasjon.</w:t>
+        <w:t xml:space="preserve">§14, iSonen-arbeidsflyten.</w:t>
+      </w:r>
+      <w:r>
+        <w:t xml:space="preserve"> </w:t>
+      </w:r>
+      <w:r>
+        <w:t xml:space="preserve">Arbeidet med Buypass, OpenTrack, FriRes og</w:t>
+      </w:r>
+      <w:r>
+        <w:t xml:space="preserve"> </w:t>
+      </w:r>
+      <w:r>
+        <w:t xml:space="preserve">EQ Timing pågår hos NFIF. Vi lover forberedt arkitektur og deltakelse i</w:t>
+      </w:r>
+      <w:r>
+        <w:t xml:space="preserve"> </w:t>
+      </w:r>
+      <w:r>
+        <w:t xml:space="preserve">spesifikasjonsarbeidet, og fastpriser integrasjonen når grensesnittene er</w:t>
+      </w:r>
+      <w:r>
+        <w:t xml:space="preserve"> </w:t>
+      </w:r>
+      <w:r>
+        <w:t xml:space="preserve">dokumentert.</w:t>
       </w:r>
     </w:p>
     <w:p>
@@ -10618,8 +10916,8 @@
         </w:pict>
       </w:r>
     </w:p>
-    <w:bookmarkEnd w:id="80"/>
-    <w:bookmarkStart w:id="81" w:name="vedlegg"/>
+    <w:bookmarkEnd w:id="81"/>
+    <w:bookmarkStart w:id="82" w:name="vedlegg"/>
     <w:p>
       <w:pPr>
         <w:pStyle w:val="Heading1"/>
@@ -10839,8 +11137,8 @@
         </w:pict>
       </w:r>
     </w:p>
-    <w:bookmarkEnd w:id="81"/>
-    <w:bookmarkStart w:id="84" w:name="vedlegg-a-kravsporing-22-og-23"/>
+    <w:bookmarkEnd w:id="82"/>
+    <w:bookmarkStart w:id="85" w:name="vedlegg-a-kravsporing-22-og-23"/>
     <w:p>
       <w:pPr>
         <w:pStyle w:val="Heading1"/>
@@ -10927,7 +11225,7 @@
         <w:t xml:space="preserve">løses kontraktuelt.</w:t>
       </w:r>
     </w:p>
-    <w:bookmarkStart w:id="82" w:name="obligatoriske-krav"/>
+    <w:bookmarkStart w:id="83" w:name="obligatoriske-krav"/>
     <w:p>
       <w:pPr>
         <w:pStyle w:val="Heading2"/>
@@ -11664,8 +11962,8 @@
         <w:t xml:space="preserve">teknisk risiko.</w:t>
       </w:r>
     </w:p>
-    <w:bookmarkEnd w:id="82"/>
-    <w:bookmarkStart w:id="83" w:name="ønskede-tilleggsfunksjoner"/>
+    <w:bookmarkEnd w:id="83"/>
+    <w:bookmarkStart w:id="84" w:name="ønskede-tilleggsfunksjoner"/>
     <w:p>
       <w:pPr>
         <w:pStyle w:val="Heading2"/>
@@ -12012,9 +12310,9 @@
         </w:pict>
       </w:r>
     </w:p>
-    <w:bookmarkEnd w:id="83"/>
     <w:bookmarkEnd w:id="84"/>
-    <w:bookmarkStart w:id="85" w:name="vedlegg-b-full-kravsporing-per-kapittel"/>
+    <w:bookmarkEnd w:id="85"/>
+    <w:bookmarkStart w:id="86" w:name="vedlegg-b-full-kravsporing-per-kapittel"/>
     <w:p>
       <w:pPr>
         <w:pStyle w:val="Heading1"/>
@@ -13006,7 +13304,7 @@
               <w:pStyle w:val="Compact"/>
             </w:pPr>
             <w:r>
-              <w:t xml:space="preserve">Fremtidig iSonen-arbeidsflyt</w:t>
+              <w:t xml:space="preserve">iSonen-arbeidsflyt</w:t>
             </w:r>
           </w:p>
         </w:tc>
@@ -13028,7 +13326,7 @@
               <w:pStyle w:val="Compact"/>
             </w:pPr>
             <w:r>
-              <w:t xml:space="preserve">Forberedt arkitektur</w:t>
+              <w:t xml:space="preserve">Forberedt arkitektur. Kobles på NFIFs pågående arbeid med Buypass.</w:t>
             </w:r>
           </w:p>
         </w:tc>
@@ -13657,7 +13955,7 @@
         </w:tc>
       </w:tr>
     </w:tbl>
-    <w:bookmarkEnd w:id="85"/>
+    <w:bookmarkEnd w:id="86"/>
     <w:sectPr>
       <w:footnotePr>
         <w:numRestart w:val="eachSect"/>

</xml_diff>

<commit_message>
Bytt til NFIFs eget begrep «løp utenfor bane»; oversendelsesbrev
«5 km gateløp» beholdes ett sted, siden det faktisk er landevei.
</commit_message>
<xml_diff>
--- a/NFIFProsjekt/tilbud/TILBUD.docx
+++ b/NFIFProsjekt/tilbud/TILBUD.docx
@@ -2424,13 +2424,13 @@
         <w:t xml:space="preserve"> </w:t>
       </w:r>
       <w:r>
-        <w:t xml:space="preserve">etter TR14.1/TR43.1 (§7), kvalitetsnivå A/B/C (§6), og datamodellen for</w:t>
-      </w:r>
-      <w:r>
-        <w:t xml:space="preserve"> </w:t>
-      </w:r>
-      <w:r>
-        <w:t xml:space="preserve">gateløp (§8). Disse er beskrevet i henholdsvis kapittel 3.5, 5 og 8.</w:t>
+        <w:t xml:space="preserve">etter TR14.1/TR43.1 (§7), kvalitetsnivå A/B/C (§6), og datamodellen for løp</w:t>
+      </w:r>
+      <w:r>
+        <w:t xml:space="preserve"> </w:t>
+      </w:r>
+      <w:r>
+        <w:t xml:space="preserve">utenfor bane (§8). Disse er beskrevet i henholdsvis kapittel 3.5, 5 og 8.</w:t>
       </w:r>
     </w:p>
     <w:bookmarkStart w:id="21" w:name="kildetrofasthet-som-prinsipp"/>
@@ -3469,7 +3469,7 @@
               <w:pStyle w:val="Compact"/>
             </w:pPr>
             <w:r>
-              <w:t xml:space="preserve">Løyperegisteret (gjelder gateløp)</w:t>
+              <w:t xml:space="preserve">Løyperegisteret (gjelder løp utenfor bane)</w:t>
             </w:r>
           </w:p>
         </w:tc>
@@ -5694,13 +5694,13 @@
     </w:p>
     <w:bookmarkEnd w:id="44"/>
     <w:bookmarkEnd w:id="45"/>
-    <w:bookmarkStart w:id="49" w:name="gateløp-veikart"/>
+    <w:bookmarkStart w:id="49" w:name="løp-utenfor-bane-veikart"/>
     <w:p>
       <w:pPr>
         <w:pStyle w:val="Heading1"/>
       </w:pPr>
       <w:r>
-        <w:t xml:space="preserve">5. Gateløp: veikart</w:t>
+        <w:t xml:space="preserve">5. Løp utenfor bane: veikart</w:t>
       </w:r>
     </w:p>
     <w:p>
@@ -5720,13 +5720,13 @@
         <w:pStyle w:val="BodyText"/>
       </w:pPr>
       <w:r>
-        <w:t xml:space="preserve">Løsningen dekker i dag banestatistikk. Gateløp er vårt største enkeltgap og må</w:t>
-      </w:r>
-      <w:r>
-        <w:t xml:space="preserve"> </w:t>
-      </w:r>
-      <w:r>
-        <w:t xml:space="preserve">bygges.</w:t>
+        <w:t xml:space="preserve">Løsningen dekker i dag banestatistikk. Løp utenfor bane er vårt største</w:t>
+      </w:r>
+      <w:r>
+        <w:t xml:space="preserve"> </w:t>
+      </w:r>
+      <w:r>
+        <w:t xml:space="preserve">enkeltgap og må bygges.</w:t>
       </w:r>
     </w:p>
     <w:p>
@@ -5740,13 +5740,13 @@
         <w:t xml:space="preserve"> </w:t>
       </w:r>
       <w:r>
-        <w:t xml:space="preserve">gateløp fra start. Veikartet følger her, slik at NFIF har det ved vurderingen</w:t>
-      </w:r>
-      <w:r>
-        <w:t xml:space="preserve"> </w:t>
-      </w:r>
-      <w:r>
-        <w:t xml:space="preserve">av tilbudet.</w:t>
+        <w:t xml:space="preserve">løp utenfor bane fra start. Veikartet følger her, slik at NFIF har det ved</w:t>
+      </w:r>
+      <w:r>
+        <w:t xml:space="preserve"> </w:t>
+      </w:r>
+      <w:r>
+        <w:t xml:space="preserve">vurderingen av tilbudet.</w:t>
       </w:r>
     </w:p>
     <w:bookmarkStart w:id="46" w:name="omfang"/>
@@ -5829,13 +5829,13 @@
       </w:r>
     </w:p>
     <w:bookmarkEnd w:id="46"/>
-    <w:bookmarkStart w:id="47" w:name="X86467ed951c6b36b4ea3134ceb482096d645801"/>
+    <w:bookmarkStart w:id="47" w:name="X6f68ef4c881000d0e86ed079ab55a43d7b17a10"/>
     <w:p>
       <w:pPr>
         <w:pStyle w:val="Heading2"/>
       </w:pPr>
       <w:r>
-        <w:t xml:space="preserve">5.2 Hvorfor gateløp likevel er en annen oppgave</w:t>
+        <w:t xml:space="preserve">5.2 Hvorfor løp utenfor bane likevel er en annen oppgave</w:t>
       </w:r>
     </w:p>
     <w:p>
@@ -5934,13 +5934,13 @@
         <w:t xml:space="preserve"> </w:t>
       </w:r>
       <w:r>
-        <w:t xml:space="preserve">er også grunnen til at kvalitetsnivåene i §6 må bygges før gateløpene, ikke</w:t>
-      </w:r>
-      <w:r>
-        <w:t xml:space="preserve"> </w:t>
-      </w:r>
-      <w:r>
-        <w:t xml:space="preserve">etter.</w:t>
+        <w:t xml:space="preserve">er også grunnen til at kvalitetsnivåene i §6 må bygges før løpene utenfor bane,</w:t>
+      </w:r>
+      <w:r>
+        <w:t xml:space="preserve"> </w:t>
+      </w:r>
+      <w:r>
+        <w:t xml:space="preserve">ikke etter.</w:t>
       </w:r>
     </w:p>
     <w:bookmarkEnd w:id="47"/>
@@ -7467,7 +7467,7 @@
               <w:pStyle w:val="Compact"/>
             </w:pPr>
             <w:r>
-              <w:t xml:space="preserve">Veikart gateløp, levert med dette tilbudet</w:t>
+              <w:t xml:space="preserve">Veikart for løp utenfor bane, levert med dette tilbudet</w:t>
             </w:r>
           </w:p>
         </w:tc>
@@ -7911,7 +7911,7 @@
               <w:pStyle w:val="Compact"/>
             </w:pPr>
             <w:r>
-              <w:t xml:space="preserve">Gateløp, jf. veikartet i kapittel 5</w:t>
+              <w:t xml:space="preserve">Løp utenfor bane, jf. veikartet i kapittel 5</w:t>
             </w:r>
           </w:p>
         </w:tc>
@@ -9062,7 +9062,7 @@
               <w:pStyle w:val="Compact"/>
             </w:pPr>
             <w:r>
-              <w:t xml:space="preserve">Gateløp viser seg mer omfattende</w:t>
+              <w:t xml:space="preserve">Løp utenfor bane viser seg mer omfattende</w:t>
             </w:r>
           </w:p>
         </w:tc>
@@ -9739,31 +9739,31 @@
         <w:t xml:space="preserve"> </w:t>
       </w:r>
       <w:r>
-        <w:t xml:space="preserve">dag. Integrasjonene i §13 avhenger av grensesnitt vi ikke har sett. Gateløpene</w:t>
-      </w:r>
-      <w:r>
-        <w:t xml:space="preserve"> </w:t>
-      </w:r>
-      <w:r>
-        <w:t xml:space="preserve">avhenger av tidtakernes datakilder. Omfanget av historisk utvidelse avhenger</w:t>
-      </w:r>
-      <w:r>
-        <w:t xml:space="preserve"> </w:t>
-      </w:r>
-      <w:r>
-        <w:t xml:space="preserve">av kilder som må kartlegges før noen vet hva de inneholder. En leverandør som</w:t>
-      </w:r>
-      <w:r>
-        <w:t xml:space="preserve"> </w:t>
-      </w:r>
-      <w:r>
-        <w:t xml:space="preserve">likevel setter et tall på disse, priser inn sin egen usikkerhet, og NFIF</w:t>
-      </w:r>
-      <w:r>
-        <w:t xml:space="preserve"> </w:t>
-      </w:r>
-      <w:r>
-        <w:t xml:space="preserve">betaler for den enten den inntreffer eller ikke.</w:t>
+        <w:t xml:space="preserve">dag. Integrasjonene i §13 avhenger av grensesnitt vi ikke har sett. Løpene</w:t>
+      </w:r>
+      <w:r>
+        <w:t xml:space="preserve"> </w:t>
+      </w:r>
+      <w:r>
+        <w:t xml:space="preserve">utenfor bane avhenger av tidtakernes datakilder. Omfanget av historisk</w:t>
+      </w:r>
+      <w:r>
+        <w:t xml:space="preserve"> </w:t>
+      </w:r>
+      <w:r>
+        <w:t xml:space="preserve">utvidelse avhenger av kilder som må kartlegges før noen vet hva de inneholder.</w:t>
+      </w:r>
+      <w:r>
+        <w:t xml:space="preserve"> </w:t>
+      </w:r>
+      <w:r>
+        <w:t xml:space="preserve">En leverandør som likevel setter et tall på disse, priser inn sin egen</w:t>
+      </w:r>
+      <w:r>
+        <w:t xml:space="preserve"> </w:t>
+      </w:r>
+      <w:r>
+        <w:t xml:space="preserve">usikkerhet, og NFIF betaler for den enten den inntreffer eller ikke.</w:t>
       </w:r>
     </w:p>
     <w:p>
@@ -9874,7 +9874,7 @@
         <w:t xml:space="preserve"> </w:t>
       </w:r>
       <w:r>
-        <w:t xml:space="preserve">Integrasjoner, gateløp og historisk</w:t>
+        <w:t xml:space="preserve">Integrasjoner, løp utenfor bane og historisk</w:t>
       </w:r>
       <w:r>
         <w:t xml:space="preserve"> </w:t>
@@ -10382,7 +10382,7 @@
               <w:pStyle w:val="Compact"/>
             </w:pPr>
             <w:r>
-              <w:t xml:space="preserve">Gateløp (§8), jf. kapittel 5</w:t>
+              <w:t xml:space="preserve">Løp utenfor bane (§8), jf. kapittel 5</w:t>
             </w:r>
           </w:p>
         </w:tc>
@@ -10792,7 +10792,7 @@
           <w:b/>
           <w:bCs/>
         </w:rPr>
-        <w:t xml:space="preserve">Gateløp</w:t>
+        <w:t xml:space="preserve">Løp utenfor bane</w:t>
       </w:r>
       <w:r>
         <w:t xml:space="preserve"> </w:t>
@@ -11450,7 +11450,7 @@
               <w:pStyle w:val="Compact"/>
             </w:pPr>
             <w:r>
-              <w:t xml:space="preserve">Løpsstatistikk, gateløp</w:t>
+              <w:t xml:space="preserve">Løpsstatistikk utenfor bane</w:t>
             </w:r>
           </w:p>
         </w:tc>
@@ -12899,7 +12899,7 @@
               <w:pStyle w:val="Compact"/>
             </w:pPr>
             <w:r>
-              <w:t xml:space="preserve">Gateløp med full metadata</w:t>
+              <w:t xml:space="preserve">Løp utenfor bane med full metadata</w:t>
             </w:r>
           </w:p>
         </w:tc>

</xml_diff>